<commit_message>
Actualiza niveles Tec Plantilla 3
</commit_message>
<xml_diff>
--- a/plantillas/Plantilla_3_Instrumentos.docx
+++ b/plantillas/Plantilla_3_Instrumentos.docx
@@ -181,12 +181,6 @@
               <w:bottom w:val="single" w:sz="4" w:space="0" w:color="000000"/>
               <w:right w:val="single" w:sz="4" w:space="0" w:color="000000"/>
             </w:tcBorders>
-            <w:tcBorders>
-              <w:top w:val="single" w:sz="4" w:space="0" w:color="000000"/>
-              <w:left w:val="single" w:sz="4" w:space="0" w:color="000000"/>
-              <w:bottom w:val="single" w:sz="4" w:space="0" w:color="000000"/>
-              <w:right w:val="single" w:sz="4" w:space="0" w:color="000000"/>
-            </w:tcBorders>
           </w:tcPr>
           <w:p>
             <w:pPr>
@@ -205,12 +199,6 @@
               <w:bottom w:val="single" w:sz="4" w:space="0" w:color="000000"/>
               <w:right w:val="single" w:sz="4" w:space="0" w:color="000000"/>
             </w:tcBorders>
-            <w:tcBorders>
-              <w:top w:val="single" w:sz="4" w:space="0" w:color="000000"/>
-              <w:left w:val="single" w:sz="4" w:space="0" w:color="000000"/>
-              <w:bottom w:val="single" w:sz="4" w:space="0" w:color="000000"/>
-              <w:right w:val="single" w:sz="4" w:space="0" w:color="000000"/>
-            </w:tcBorders>
           </w:tcPr>
           <w:p>
             <w:pPr>
@@ -229,12 +217,6 @@
               <w:bottom w:val="single" w:sz="4" w:space="0" w:color="000000"/>
               <w:right w:val="single" w:sz="4" w:space="0" w:color="000000"/>
             </w:tcBorders>
-            <w:tcBorders>
-              <w:top w:val="single" w:sz="4" w:space="0" w:color="000000"/>
-              <w:left w:val="single" w:sz="4" w:space="0" w:color="000000"/>
-              <w:bottom w:val="single" w:sz="4" w:space="0" w:color="000000"/>
-              <w:right w:val="single" w:sz="4" w:space="0" w:color="000000"/>
-            </w:tcBorders>
           </w:tcPr>
           <w:p>
             <w:pPr>
@@ -255,12 +237,6 @@
               <w:bottom w:val="single" w:sz="4" w:space="0" w:color="000000"/>
               <w:right w:val="single" w:sz="4" w:space="0" w:color="000000"/>
             </w:tcBorders>
-            <w:tcBorders>
-              <w:top w:val="single" w:sz="4" w:space="0" w:color="000000"/>
-              <w:left w:val="single" w:sz="4" w:space="0" w:color="000000"/>
-              <w:bottom w:val="single" w:sz="4" w:space="0" w:color="000000"/>
-              <w:right w:val="single" w:sz="4" w:space="0" w:color="000000"/>
-            </w:tcBorders>
           </w:tcPr>
           <w:p>
             <w:pPr>
@@ -279,50 +255,32 @@
               <w:bottom w:val="single" w:sz="4" w:space="0" w:color="000000"/>
               <w:right w:val="single" w:sz="4" w:space="0" w:color="000000"/>
             </w:tcBorders>
-            <w:tcBorders>
-              <w:top w:val="single" w:sz="4" w:space="0" w:color="000000"/>
-              <w:left w:val="single" w:sz="4" w:space="0" w:color="000000"/>
-              <w:bottom w:val="single" w:sz="4" w:space="0" w:color="000000"/>
-              <w:right w:val="single" w:sz="4" w:space="0" w:color="000000"/>
-            </w:tcBorders>
-          </w:tcPr>
-          <w:p>
-            <w:pPr>
-              <w:pStyle w:val="Compact"/>
-            </w:pPr>
-          </w:p>
-        </w:tc>
-        <w:tc>
-          <w:tcPr>
-            <w:tcBorders>
-              <w:top w:val="single" w:sz="4" w:space="0" w:color="000000"/>
-              <w:left w:val="single" w:sz="4" w:space="0" w:color="000000"/>
-              <w:bottom w:val="single" w:sz="4" w:space="0" w:color="000000"/>
-              <w:right w:val="single" w:sz="4" w:space="0" w:color="000000"/>
-            </w:tcBorders>
-            <w:tcBorders>
-              <w:top w:val="single" w:sz="4" w:space="0" w:color="000000"/>
-              <w:left w:val="single" w:sz="4" w:space="0" w:color="000000"/>
-              <w:bottom w:val="single" w:sz="4" w:space="0" w:color="000000"/>
-              <w:right w:val="single" w:sz="4" w:space="0" w:color="000000"/>
-            </w:tcBorders>
-          </w:tcPr>
-          <w:p>
-            <w:pPr>
-              <w:pStyle w:val="Compact"/>
-            </w:pPr>
-          </w:p>
-        </w:tc>
-      </w:tr>
-      <w:tr>
-        <w:tc>
-          <w:tcPr>
-            <w:tcBorders>
-              <w:top w:val="single" w:sz="4" w:space="0" w:color="000000"/>
-              <w:left w:val="single" w:sz="4" w:space="0" w:color="000000"/>
-              <w:bottom w:val="single" w:sz="4" w:space="0" w:color="000000"/>
-              <w:right w:val="single" w:sz="4" w:space="0" w:color="000000"/>
-            </w:tcBorders>
+          </w:tcPr>
+          <w:p>
+            <w:pPr>
+              <w:pStyle w:val="Compact"/>
+            </w:pPr>
+          </w:p>
+        </w:tc>
+        <w:tc>
+          <w:tcPr>
+            <w:tcBorders>
+              <w:top w:val="single" w:sz="4" w:space="0" w:color="000000"/>
+              <w:left w:val="single" w:sz="4" w:space="0" w:color="000000"/>
+              <w:bottom w:val="single" w:sz="4" w:space="0" w:color="000000"/>
+              <w:right w:val="single" w:sz="4" w:space="0" w:color="000000"/>
+            </w:tcBorders>
+          </w:tcPr>
+          <w:p>
+            <w:pPr>
+              <w:pStyle w:val="Compact"/>
+            </w:pPr>
+          </w:p>
+        </w:tc>
+      </w:tr>
+      <w:tr>
+        <w:tc>
+          <w:tcPr>
             <w:tcBorders>
               <w:top w:val="single" w:sz="4" w:space="0" w:color="000000"/>
               <w:left w:val="single" w:sz="4" w:space="0" w:color="000000"/>
@@ -347,50 +305,32 @@
               <w:bottom w:val="single" w:sz="4" w:space="0" w:color="000000"/>
               <w:right w:val="single" w:sz="4" w:space="0" w:color="000000"/>
             </w:tcBorders>
-            <w:tcBorders>
-              <w:top w:val="single" w:sz="4" w:space="0" w:color="000000"/>
-              <w:left w:val="single" w:sz="4" w:space="0" w:color="000000"/>
-              <w:bottom w:val="single" w:sz="4" w:space="0" w:color="000000"/>
-              <w:right w:val="single" w:sz="4" w:space="0" w:color="000000"/>
-            </w:tcBorders>
-          </w:tcPr>
-          <w:p>
-            <w:pPr>
-              <w:pStyle w:val="Compact"/>
-            </w:pPr>
-          </w:p>
-        </w:tc>
-        <w:tc>
-          <w:tcPr>
-            <w:tcBorders>
-              <w:top w:val="single" w:sz="4" w:space="0" w:color="000000"/>
-              <w:left w:val="single" w:sz="4" w:space="0" w:color="000000"/>
-              <w:bottom w:val="single" w:sz="4" w:space="0" w:color="000000"/>
-              <w:right w:val="single" w:sz="4" w:space="0" w:color="000000"/>
-            </w:tcBorders>
-            <w:tcBorders>
-              <w:top w:val="single" w:sz="4" w:space="0" w:color="000000"/>
-              <w:left w:val="single" w:sz="4" w:space="0" w:color="000000"/>
-              <w:bottom w:val="single" w:sz="4" w:space="0" w:color="000000"/>
-              <w:right w:val="single" w:sz="4" w:space="0" w:color="000000"/>
-            </w:tcBorders>
-          </w:tcPr>
-          <w:p>
-            <w:pPr>
-              <w:pStyle w:val="Compact"/>
-            </w:pPr>
-          </w:p>
-        </w:tc>
-      </w:tr>
-      <w:tr>
-        <w:tc>
-          <w:tcPr>
-            <w:tcBorders>
-              <w:top w:val="single" w:sz="4" w:space="0" w:color="000000"/>
-              <w:left w:val="single" w:sz="4" w:space="0" w:color="000000"/>
-              <w:bottom w:val="single" w:sz="4" w:space="0" w:color="000000"/>
-              <w:right w:val="single" w:sz="4" w:space="0" w:color="000000"/>
-            </w:tcBorders>
+          </w:tcPr>
+          <w:p>
+            <w:pPr>
+              <w:pStyle w:val="Compact"/>
+            </w:pPr>
+          </w:p>
+        </w:tc>
+        <w:tc>
+          <w:tcPr>
+            <w:tcBorders>
+              <w:top w:val="single" w:sz="4" w:space="0" w:color="000000"/>
+              <w:left w:val="single" w:sz="4" w:space="0" w:color="000000"/>
+              <w:bottom w:val="single" w:sz="4" w:space="0" w:color="000000"/>
+              <w:right w:val="single" w:sz="4" w:space="0" w:color="000000"/>
+            </w:tcBorders>
+          </w:tcPr>
+          <w:p>
+            <w:pPr>
+              <w:pStyle w:val="Compact"/>
+            </w:pPr>
+          </w:p>
+        </w:tc>
+      </w:tr>
+      <w:tr>
+        <w:tc>
+          <w:tcPr>
             <w:tcBorders>
               <w:top w:val="single" w:sz="4" w:space="0" w:color="000000"/>
               <w:left w:val="single" w:sz="4" w:space="0" w:color="000000"/>
@@ -415,50 +355,32 @@
               <w:bottom w:val="single" w:sz="4" w:space="0" w:color="000000"/>
               <w:right w:val="single" w:sz="4" w:space="0" w:color="000000"/>
             </w:tcBorders>
-            <w:tcBorders>
-              <w:top w:val="single" w:sz="4" w:space="0" w:color="000000"/>
-              <w:left w:val="single" w:sz="4" w:space="0" w:color="000000"/>
-              <w:bottom w:val="single" w:sz="4" w:space="0" w:color="000000"/>
-              <w:right w:val="single" w:sz="4" w:space="0" w:color="000000"/>
-            </w:tcBorders>
-          </w:tcPr>
-          <w:p>
-            <w:pPr>
-              <w:pStyle w:val="Compact"/>
-            </w:pPr>
-          </w:p>
-        </w:tc>
-        <w:tc>
-          <w:tcPr>
-            <w:tcBorders>
-              <w:top w:val="single" w:sz="4" w:space="0" w:color="000000"/>
-              <w:left w:val="single" w:sz="4" w:space="0" w:color="000000"/>
-              <w:bottom w:val="single" w:sz="4" w:space="0" w:color="000000"/>
-              <w:right w:val="single" w:sz="4" w:space="0" w:color="000000"/>
-            </w:tcBorders>
-            <w:tcBorders>
-              <w:top w:val="single" w:sz="4" w:space="0" w:color="000000"/>
-              <w:left w:val="single" w:sz="4" w:space="0" w:color="000000"/>
-              <w:bottom w:val="single" w:sz="4" w:space="0" w:color="000000"/>
-              <w:right w:val="single" w:sz="4" w:space="0" w:color="000000"/>
-            </w:tcBorders>
-          </w:tcPr>
-          <w:p>
-            <w:pPr>
-              <w:pStyle w:val="Compact"/>
-            </w:pPr>
-          </w:p>
-        </w:tc>
-      </w:tr>
-      <w:tr>
-        <w:tc>
-          <w:tcPr>
-            <w:tcBorders>
-              <w:top w:val="single" w:sz="4" w:space="0" w:color="000000"/>
-              <w:left w:val="single" w:sz="4" w:space="0" w:color="000000"/>
-              <w:bottom w:val="single" w:sz="4" w:space="0" w:color="000000"/>
-              <w:right w:val="single" w:sz="4" w:space="0" w:color="000000"/>
-            </w:tcBorders>
+          </w:tcPr>
+          <w:p>
+            <w:pPr>
+              <w:pStyle w:val="Compact"/>
+            </w:pPr>
+          </w:p>
+        </w:tc>
+        <w:tc>
+          <w:tcPr>
+            <w:tcBorders>
+              <w:top w:val="single" w:sz="4" w:space="0" w:color="000000"/>
+              <w:left w:val="single" w:sz="4" w:space="0" w:color="000000"/>
+              <w:bottom w:val="single" w:sz="4" w:space="0" w:color="000000"/>
+              <w:right w:val="single" w:sz="4" w:space="0" w:color="000000"/>
+            </w:tcBorders>
+          </w:tcPr>
+          <w:p>
+            <w:pPr>
+              <w:pStyle w:val="Compact"/>
+            </w:pPr>
+          </w:p>
+        </w:tc>
+      </w:tr>
+      <w:tr>
+        <w:tc>
+          <w:tcPr>
             <w:tcBorders>
               <w:top w:val="single" w:sz="4" w:space="0" w:color="000000"/>
               <w:left w:val="single" w:sz="4" w:space="0" w:color="000000"/>
@@ -483,27 +405,15 @@
               <w:bottom w:val="single" w:sz="4" w:space="0" w:color="000000"/>
               <w:right w:val="single" w:sz="4" w:space="0" w:color="000000"/>
             </w:tcBorders>
-            <w:tcBorders>
-              <w:top w:val="single" w:sz="4" w:space="0" w:color="000000"/>
-              <w:left w:val="single" w:sz="4" w:space="0" w:color="000000"/>
-              <w:bottom w:val="single" w:sz="4" w:space="0" w:color="000000"/>
-              <w:right w:val="single" w:sz="4" w:space="0" w:color="000000"/>
-            </w:tcBorders>
-          </w:tcPr>
-          <w:p>
-            <w:pPr>
-              <w:pStyle w:val="Compact"/>
-            </w:pPr>
-          </w:p>
-        </w:tc>
-        <w:tc>
-          <w:tcPr>
-            <w:tcBorders>
-              <w:top w:val="single" w:sz="4" w:space="0" w:color="000000"/>
-              <w:left w:val="single" w:sz="4" w:space="0" w:color="000000"/>
-              <w:bottom w:val="single" w:sz="4" w:space="0" w:color="000000"/>
-              <w:right w:val="single" w:sz="4" w:space="0" w:color="000000"/>
-            </w:tcBorders>
+          </w:tcPr>
+          <w:p>
+            <w:pPr>
+              <w:pStyle w:val="Compact"/>
+            </w:pPr>
+          </w:p>
+        </w:tc>
+        <w:tc>
+          <w:tcPr>
             <w:tcBorders>
               <w:top w:val="single" w:sz="4" w:space="0" w:color="000000"/>
               <w:left w:val="single" w:sz="4" w:space="0" w:color="000000"/>
@@ -580,12 +490,6 @@
               <w:bottom w:val="single" w:sz="4" w:space="0" w:color="000000"/>
               <w:right w:val="single" w:sz="4" w:space="0" w:color="000000"/>
             </w:tcBorders>
-            <w:tcBorders>
-              <w:top w:val="single" w:sz="4" w:space="0" w:color="000000"/>
-              <w:left w:val="single" w:sz="4" w:space="0" w:color="000000"/>
-              <w:bottom w:val="single" w:sz="4" w:space="0" w:color="000000"/>
-              <w:right w:val="single" w:sz="4" w:space="0" w:color="000000"/>
-            </w:tcBorders>
           </w:tcPr>
           <w:p>
             <w:pPr>
@@ -604,12 +508,6 @@
               <w:bottom w:val="single" w:sz="4" w:space="0" w:color="000000"/>
               <w:right w:val="single" w:sz="4" w:space="0" w:color="000000"/>
             </w:tcBorders>
-            <w:tcBorders>
-              <w:top w:val="single" w:sz="4" w:space="0" w:color="000000"/>
-              <w:left w:val="single" w:sz="4" w:space="0" w:color="000000"/>
-              <w:bottom w:val="single" w:sz="4" w:space="0" w:color="000000"/>
-              <w:right w:val="single" w:sz="4" w:space="0" w:color="000000"/>
-            </w:tcBorders>
           </w:tcPr>
           <w:p>
             <w:pPr>
@@ -630,12 +528,6 @@
               <w:bottom w:val="single" w:sz="4" w:space="0" w:color="000000"/>
               <w:right w:val="single" w:sz="4" w:space="0" w:color="000000"/>
             </w:tcBorders>
-            <w:tcBorders>
-              <w:top w:val="single" w:sz="4" w:space="0" w:color="000000"/>
-              <w:left w:val="single" w:sz="4" w:space="0" w:color="000000"/>
-              <w:bottom w:val="single" w:sz="4" w:space="0" w:color="000000"/>
-              <w:right w:val="single" w:sz="4" w:space="0" w:color="000000"/>
-            </w:tcBorders>
           </w:tcPr>
           <w:p>
             <w:pPr>
@@ -654,12 +546,6 @@
               <w:bottom w:val="single" w:sz="4" w:space="0" w:color="000000"/>
               <w:right w:val="single" w:sz="4" w:space="0" w:color="000000"/>
             </w:tcBorders>
-            <w:tcBorders>
-              <w:top w:val="single" w:sz="4" w:space="0" w:color="000000"/>
-              <w:left w:val="single" w:sz="4" w:space="0" w:color="000000"/>
-              <w:bottom w:val="single" w:sz="4" w:space="0" w:color="000000"/>
-              <w:right w:val="single" w:sz="4" w:space="0" w:color="000000"/>
-            </w:tcBorders>
           </w:tcPr>
           <w:p>
             <w:pPr>
@@ -680,12 +566,6 @@
               <w:bottom w:val="single" w:sz="4" w:space="0" w:color="000000"/>
               <w:right w:val="single" w:sz="4" w:space="0" w:color="000000"/>
             </w:tcBorders>
-            <w:tcBorders>
-              <w:top w:val="single" w:sz="4" w:space="0" w:color="000000"/>
-              <w:left w:val="single" w:sz="4" w:space="0" w:color="000000"/>
-              <w:bottom w:val="single" w:sz="4" w:space="0" w:color="000000"/>
-              <w:right w:val="single" w:sz="4" w:space="0" w:color="000000"/>
-            </w:tcBorders>
           </w:tcPr>
           <w:p>
             <w:pPr>
@@ -704,29 +584,17 @@
               <w:bottom w:val="single" w:sz="4" w:space="0" w:color="000000"/>
               <w:right w:val="single" w:sz="4" w:space="0" w:color="000000"/>
             </w:tcBorders>
-            <w:tcBorders>
-              <w:top w:val="single" w:sz="4" w:space="0" w:color="000000"/>
-              <w:left w:val="single" w:sz="4" w:space="0" w:color="000000"/>
-              <w:bottom w:val="single" w:sz="4" w:space="0" w:color="000000"/>
-              <w:right w:val="single" w:sz="4" w:space="0" w:color="000000"/>
-            </w:tcBorders>
-          </w:tcPr>
-          <w:p>
-            <w:pPr>
-              <w:pStyle w:val="Compact"/>
-            </w:pPr>
-          </w:p>
-        </w:tc>
-      </w:tr>
-      <w:tr>
-        <w:tc>
-          <w:tcPr>
-            <w:tcBorders>
-              <w:top w:val="single" w:sz="4" w:space="0" w:color="000000"/>
-              <w:left w:val="single" w:sz="4" w:space="0" w:color="000000"/>
-              <w:bottom w:val="single" w:sz="4" w:space="0" w:color="000000"/>
-              <w:right w:val="single" w:sz="4" w:space="0" w:color="000000"/>
-            </w:tcBorders>
+          </w:tcPr>
+          <w:p>
+            <w:pPr>
+              <w:pStyle w:val="Compact"/>
+            </w:pPr>
+          </w:p>
+        </w:tc>
+      </w:tr>
+      <w:tr>
+        <w:tc>
+          <w:tcPr>
             <w:tcBorders>
               <w:top w:val="single" w:sz="4" w:space="0" w:color="000000"/>
               <w:left w:val="single" w:sz="4" w:space="0" w:color="000000"/>
@@ -751,12 +619,6 @@
               <w:bottom w:val="single" w:sz="4" w:space="0" w:color="000000"/>
               <w:right w:val="single" w:sz="4" w:space="0" w:color="000000"/>
             </w:tcBorders>
-            <w:tcBorders>
-              <w:top w:val="single" w:sz="4" w:space="0" w:color="000000"/>
-              <w:left w:val="single" w:sz="4" w:space="0" w:color="000000"/>
-              <w:bottom w:val="single" w:sz="4" w:space="0" w:color="000000"/>
-              <w:right w:val="single" w:sz="4" w:space="0" w:color="000000"/>
-            </w:tcBorders>
           </w:tcPr>
           <w:p>
             <w:pPr>
@@ -777,12 +639,6 @@
               <w:bottom w:val="single" w:sz="4" w:space="0" w:color="000000"/>
               <w:right w:val="single" w:sz="4" w:space="0" w:color="000000"/>
             </w:tcBorders>
-            <w:tcBorders>
-              <w:top w:val="single" w:sz="4" w:space="0" w:color="000000"/>
-              <w:left w:val="single" w:sz="4" w:space="0" w:color="000000"/>
-              <w:bottom w:val="single" w:sz="4" w:space="0" w:color="000000"/>
-              <w:right w:val="single" w:sz="4" w:space="0" w:color="000000"/>
-            </w:tcBorders>
           </w:tcPr>
           <w:p>
             <w:pPr>
@@ -801,29 +657,17 @@
               <w:bottom w:val="single" w:sz="4" w:space="0" w:color="000000"/>
               <w:right w:val="single" w:sz="4" w:space="0" w:color="000000"/>
             </w:tcBorders>
-            <w:tcBorders>
-              <w:top w:val="single" w:sz="4" w:space="0" w:color="000000"/>
-              <w:left w:val="single" w:sz="4" w:space="0" w:color="000000"/>
-              <w:bottom w:val="single" w:sz="4" w:space="0" w:color="000000"/>
-              <w:right w:val="single" w:sz="4" w:space="0" w:color="000000"/>
-            </w:tcBorders>
-          </w:tcPr>
-          <w:p>
-            <w:pPr>
-              <w:pStyle w:val="Compact"/>
-            </w:pPr>
-          </w:p>
-        </w:tc>
-      </w:tr>
-      <w:tr>
-        <w:tc>
-          <w:tcPr>
-            <w:tcBorders>
-              <w:top w:val="single" w:sz="4" w:space="0" w:color="000000"/>
-              <w:left w:val="single" w:sz="4" w:space="0" w:color="000000"/>
-              <w:bottom w:val="single" w:sz="4" w:space="0" w:color="000000"/>
-              <w:right w:val="single" w:sz="4" w:space="0" w:color="000000"/>
-            </w:tcBorders>
+          </w:tcPr>
+          <w:p>
+            <w:pPr>
+              <w:pStyle w:val="Compact"/>
+            </w:pPr>
+          </w:p>
+        </w:tc>
+      </w:tr>
+      <w:tr>
+        <w:tc>
+          <w:tcPr>
             <w:tcBorders>
               <w:top w:val="single" w:sz="4" w:space="0" w:color="000000"/>
               <w:left w:val="single" w:sz="4" w:space="0" w:color="000000"/>
@@ -848,29 +692,17 @@
               <w:bottom w:val="single" w:sz="4" w:space="0" w:color="000000"/>
               <w:right w:val="single" w:sz="4" w:space="0" w:color="000000"/>
             </w:tcBorders>
-            <w:tcBorders>
-              <w:top w:val="single" w:sz="4" w:space="0" w:color="000000"/>
-              <w:left w:val="single" w:sz="4" w:space="0" w:color="000000"/>
-              <w:bottom w:val="single" w:sz="4" w:space="0" w:color="000000"/>
-              <w:right w:val="single" w:sz="4" w:space="0" w:color="000000"/>
-            </w:tcBorders>
-          </w:tcPr>
-          <w:p>
-            <w:pPr>
-              <w:pStyle w:val="Compact"/>
-            </w:pPr>
-          </w:p>
-        </w:tc>
-      </w:tr>
-      <w:tr>
-        <w:tc>
-          <w:tcPr>
-            <w:tcBorders>
-              <w:top w:val="single" w:sz="4" w:space="0" w:color="000000"/>
-              <w:left w:val="single" w:sz="4" w:space="0" w:color="000000"/>
-              <w:bottom w:val="single" w:sz="4" w:space="0" w:color="000000"/>
-              <w:right w:val="single" w:sz="4" w:space="0" w:color="000000"/>
-            </w:tcBorders>
+          </w:tcPr>
+          <w:p>
+            <w:pPr>
+              <w:pStyle w:val="Compact"/>
+            </w:pPr>
+          </w:p>
+        </w:tc>
+      </w:tr>
+      <w:tr>
+        <w:tc>
+          <w:tcPr>
             <w:tcBorders>
               <w:top w:val="single" w:sz="4" w:space="0" w:color="000000"/>
               <w:left w:val="single" w:sz="4" w:space="0" w:color="000000"/>
@@ -889,12 +721,6 @@
         </w:tc>
         <w:tc>
           <w:tcPr>
-            <w:tcBorders>
-              <w:top w:val="single" w:sz="4" w:space="0" w:color="000000"/>
-              <w:left w:val="single" w:sz="4" w:space="0" w:color="000000"/>
-              <w:bottom w:val="single" w:sz="4" w:space="0" w:color="000000"/>
-              <w:right w:val="single" w:sz="4" w:space="0" w:color="000000"/>
-            </w:tcBorders>
             <w:tcBorders>
               <w:top w:val="single" w:sz="4" w:space="0" w:color="000000"/>
               <w:left w:val="single" w:sz="4" w:space="0" w:color="000000"/>
@@ -1053,12 +879,6 @@
               <w:bottom w:val="single" w:sz="4" w:space="0" w:color="000000"/>
               <w:right w:val="single" w:sz="4" w:space="0" w:color="000000"/>
             </w:tcBorders>
-            <w:tcBorders>
-              <w:top w:val="single" w:sz="4" w:space="0" w:color="000000"/>
-              <w:left w:val="single" w:sz="4" w:space="0" w:color="000000"/>
-              <w:bottom w:val="single" w:sz="4" w:space="0" w:color="000000"/>
-              <w:right w:val="single" w:sz="4" w:space="0" w:color="000000"/>
-            </w:tcBorders>
           </w:tcPr>
           <w:p>
             <w:pPr>
@@ -1077,12 +897,6 @@
               <w:bottom w:val="single" w:sz="4" w:space="0" w:color="000000"/>
               <w:right w:val="single" w:sz="4" w:space="0" w:color="000000"/>
             </w:tcBorders>
-            <w:tcBorders>
-              <w:top w:val="single" w:sz="4" w:space="0" w:color="000000"/>
-              <w:left w:val="single" w:sz="4" w:space="0" w:color="000000"/>
-              <w:bottom w:val="single" w:sz="4" w:space="0" w:color="000000"/>
-              <w:right w:val="single" w:sz="4" w:space="0" w:color="000000"/>
-            </w:tcBorders>
           </w:tcPr>
           <w:p>
             <w:pPr>
@@ -1097,12 +911,6 @@
       <w:tr>
         <w:tc>
           <w:tcPr>
-            <w:tcBorders>
-              <w:top w:val="single" w:sz="4" w:space="0" w:color="000000"/>
-              <w:left w:val="single" w:sz="4" w:space="0" w:color="000000"/>
-              <w:bottom w:val="single" w:sz="4" w:space="0" w:color="000000"/>
-              <w:right w:val="single" w:sz="4" w:space="0" w:color="000000"/>
-            </w:tcBorders>
             <w:tcBorders>
               <w:top w:val="single" w:sz="4" w:space="0" w:color="000000"/>
               <w:left w:val="single" w:sz="4" w:space="0" w:color="000000"/>
@@ -1119,41 +927,29 @@
                 <w:b/>
                 <w:bCs/>
               </w:rPr>
-              <w:t xml:space="preserve">3 - Avanzado</w:t>
-            </w:r>
-          </w:p>
-        </w:tc>
-        <w:tc>
-          <w:tcPr>
-            <w:tcBorders>
-              <w:top w:val="single" w:sz="4" w:space="0" w:color="000000"/>
-              <w:left w:val="single" w:sz="4" w:space="0" w:color="000000"/>
-              <w:bottom w:val="single" w:sz="4" w:space="0" w:color="000000"/>
-              <w:right w:val="single" w:sz="4" w:space="0" w:color="000000"/>
-            </w:tcBorders>
-            <w:tcBorders>
-              <w:top w:val="single" w:sz="4" w:space="0" w:color="000000"/>
-              <w:left w:val="single" w:sz="4" w:space="0" w:color="000000"/>
-              <w:bottom w:val="single" w:sz="4" w:space="0" w:color="000000"/>
-              <w:right w:val="single" w:sz="4" w:space="0" w:color="000000"/>
-            </w:tcBorders>
-          </w:tcPr>
-          <w:p>
-            <w:pPr>
-              <w:pStyle w:val="Compact"/>
-            </w:pPr>
-          </w:p>
-        </w:tc>
-      </w:tr>
-      <w:tr>
-        <w:tc>
-          <w:tcPr>
-            <w:tcBorders>
-              <w:top w:val="single" w:sz="4" w:space="0" w:color="000000"/>
-              <w:left w:val="single" w:sz="4" w:space="0" w:color="000000"/>
-              <w:bottom w:val="single" w:sz="4" w:space="0" w:color="000000"/>
-              <w:right w:val="single" w:sz="4" w:space="0" w:color="000000"/>
-            </w:tcBorders>
+              <w:t xml:space="preserve">4 - Destacado</w:t>
+            </w:r>
+          </w:p>
+        </w:tc>
+        <w:tc>
+          <w:tcPr>
+            <w:tcBorders>
+              <w:top w:val="single" w:sz="4" w:space="0" w:color="000000"/>
+              <w:left w:val="single" w:sz="4" w:space="0" w:color="000000"/>
+              <w:bottom w:val="single" w:sz="4" w:space="0" w:color="000000"/>
+              <w:right w:val="single" w:sz="4" w:space="0" w:color="000000"/>
+            </w:tcBorders>
+          </w:tcPr>
+          <w:p>
+            <w:pPr>
+              <w:pStyle w:val="Compact"/>
+            </w:pPr>
+          </w:p>
+        </w:tc>
+      </w:tr>
+      <w:tr>
+        <w:tc>
+          <w:tcPr>
             <w:tcBorders>
               <w:top w:val="single" w:sz="4" w:space="0" w:color="000000"/>
               <w:left w:val="single" w:sz="4" w:space="0" w:color="000000"/>
@@ -1170,41 +966,29 @@
                 <w:b/>
                 <w:bCs/>
               </w:rPr>
-              <w:t xml:space="preserve">2 - En desarrollo</w:t>
-            </w:r>
-          </w:p>
-        </w:tc>
-        <w:tc>
-          <w:tcPr>
-            <w:tcBorders>
-              <w:top w:val="single" w:sz="4" w:space="0" w:color="000000"/>
-              <w:left w:val="single" w:sz="4" w:space="0" w:color="000000"/>
-              <w:bottom w:val="single" w:sz="4" w:space="0" w:color="000000"/>
-              <w:right w:val="single" w:sz="4" w:space="0" w:color="000000"/>
-            </w:tcBorders>
-            <w:tcBorders>
-              <w:top w:val="single" w:sz="4" w:space="0" w:color="000000"/>
-              <w:left w:val="single" w:sz="4" w:space="0" w:color="000000"/>
-              <w:bottom w:val="single" w:sz="4" w:space="0" w:color="000000"/>
-              <w:right w:val="single" w:sz="4" w:space="0" w:color="000000"/>
-            </w:tcBorders>
-          </w:tcPr>
-          <w:p>
-            <w:pPr>
-              <w:pStyle w:val="Compact"/>
-            </w:pPr>
-          </w:p>
-        </w:tc>
-      </w:tr>
-      <w:tr>
-        <w:tc>
-          <w:tcPr>
-            <w:tcBorders>
-              <w:top w:val="single" w:sz="4" w:space="0" w:color="000000"/>
-              <w:left w:val="single" w:sz="4" w:space="0" w:color="000000"/>
-              <w:bottom w:val="single" w:sz="4" w:space="0" w:color="000000"/>
-              <w:right w:val="single" w:sz="4" w:space="0" w:color="000000"/>
-            </w:tcBorders>
+              <w:t xml:space="preserve">3 - Sólido</w:t>
+            </w:r>
+          </w:p>
+        </w:tc>
+        <w:tc>
+          <w:tcPr>
+            <w:tcBorders>
+              <w:top w:val="single" w:sz="4" w:space="0" w:color="000000"/>
+              <w:left w:val="single" w:sz="4" w:space="0" w:color="000000"/>
+              <w:bottom w:val="single" w:sz="4" w:space="0" w:color="000000"/>
+              <w:right w:val="single" w:sz="4" w:space="0" w:color="000000"/>
+            </w:tcBorders>
+          </w:tcPr>
+          <w:p>
+            <w:pPr>
+              <w:pStyle w:val="Compact"/>
+            </w:pPr>
+          </w:p>
+        </w:tc>
+      </w:tr>
+      <w:tr>
+        <w:tc>
+          <w:tcPr>
             <w:tcBorders>
               <w:top w:val="single" w:sz="4" w:space="0" w:color="000000"/>
               <w:left w:val="single" w:sz="4" w:space="0" w:color="000000"/>
@@ -1221,41 +1005,29 @@
                 <w:b/>
                 <w:bCs/>
               </w:rPr>
-              <w:t xml:space="preserve">1 - Inicial</w:t>
-            </w:r>
-          </w:p>
-        </w:tc>
-        <w:tc>
-          <w:tcPr>
-            <w:tcBorders>
-              <w:top w:val="single" w:sz="4" w:space="0" w:color="000000"/>
-              <w:left w:val="single" w:sz="4" w:space="0" w:color="000000"/>
-              <w:bottom w:val="single" w:sz="4" w:space="0" w:color="000000"/>
-              <w:right w:val="single" w:sz="4" w:space="0" w:color="000000"/>
-            </w:tcBorders>
-            <w:tcBorders>
-              <w:top w:val="single" w:sz="4" w:space="0" w:color="000000"/>
-              <w:left w:val="single" w:sz="4" w:space="0" w:color="000000"/>
-              <w:bottom w:val="single" w:sz="4" w:space="0" w:color="000000"/>
-              <w:right w:val="single" w:sz="4" w:space="0" w:color="000000"/>
-            </w:tcBorders>
-          </w:tcPr>
-          <w:p>
-            <w:pPr>
-              <w:pStyle w:val="Compact"/>
-            </w:pPr>
-          </w:p>
-        </w:tc>
-      </w:tr>
-      <w:tr>
-        <w:tc>
-          <w:tcPr>
-            <w:tcBorders>
-              <w:top w:val="single" w:sz="4" w:space="0" w:color="000000"/>
-              <w:left w:val="single" w:sz="4" w:space="0" w:color="000000"/>
-              <w:bottom w:val="single" w:sz="4" w:space="0" w:color="000000"/>
-              <w:right w:val="single" w:sz="4" w:space="0" w:color="000000"/>
-            </w:tcBorders>
+              <w:t xml:space="preserve">2 - Básico</w:t>
+            </w:r>
+          </w:p>
+        </w:tc>
+        <w:tc>
+          <w:tcPr>
+            <w:tcBorders>
+              <w:top w:val="single" w:sz="4" w:space="0" w:color="000000"/>
+              <w:left w:val="single" w:sz="4" w:space="0" w:color="000000"/>
+              <w:bottom w:val="single" w:sz="4" w:space="0" w:color="000000"/>
+              <w:right w:val="single" w:sz="4" w:space="0" w:color="000000"/>
+            </w:tcBorders>
+          </w:tcPr>
+          <w:p>
+            <w:pPr>
+              <w:pStyle w:val="Compact"/>
+            </w:pPr>
+          </w:p>
+        </w:tc>
+      </w:tr>
+      <w:tr>
+        <w:tc>
+          <w:tcPr>
             <w:tcBorders>
               <w:top w:val="single" w:sz="4" w:space="0" w:color="000000"/>
               <w:left w:val="single" w:sz="4" w:space="0" w:color="000000"/>
@@ -1272,18 +1044,12 @@
                 <w:b/>
                 <w:bCs/>
               </w:rPr>
-              <w:t xml:space="preserve">0 - No presentado</w:t>
-            </w:r>
-          </w:p>
-        </w:tc>
-        <w:tc>
-          <w:tcPr>
-            <w:tcBorders>
-              <w:top w:val="single" w:sz="4" w:space="0" w:color="000000"/>
-              <w:left w:val="single" w:sz="4" w:space="0" w:color="000000"/>
-              <w:bottom w:val="single" w:sz="4" w:space="0" w:color="000000"/>
-              <w:right w:val="single" w:sz="4" w:space="0" w:color="000000"/>
-            </w:tcBorders>
+              <w:t xml:space="preserve">1 - Incipiente</w:t>
+            </w:r>
+          </w:p>
+        </w:tc>
+        <w:tc>
+          <w:tcPr>
             <w:tcBorders>
               <w:top w:val="single" w:sz="4" w:space="0" w:color="000000"/>
               <w:left w:val="single" w:sz="4" w:space="0" w:color="000000"/>
@@ -1331,12 +1097,6 @@
               <w:bottom w:val="single" w:sz="4" w:space="0" w:color="000000"/>
               <w:right w:val="single" w:sz="4" w:space="0" w:color="000000"/>
             </w:tcBorders>
-            <w:tcBorders>
-              <w:top w:val="single" w:sz="4" w:space="0" w:color="000000"/>
-              <w:left w:val="single" w:sz="4" w:space="0" w:color="000000"/>
-              <w:bottom w:val="single" w:sz="4" w:space="0" w:color="000000"/>
-              <w:right w:val="single" w:sz="4" w:space="0" w:color="000000"/>
-            </w:tcBorders>
           </w:tcPr>
           <w:p>
             <w:pPr>
@@ -1355,12 +1115,6 @@
               <w:bottom w:val="single" w:sz="4" w:space="0" w:color="000000"/>
               <w:right w:val="single" w:sz="4" w:space="0" w:color="000000"/>
             </w:tcBorders>
-            <w:tcBorders>
-              <w:top w:val="single" w:sz="4" w:space="0" w:color="000000"/>
-              <w:left w:val="single" w:sz="4" w:space="0" w:color="000000"/>
-              <w:bottom w:val="single" w:sz="4" w:space="0" w:color="000000"/>
-              <w:right w:val="single" w:sz="4" w:space="0" w:color="000000"/>
-            </w:tcBorders>
           </w:tcPr>
           <w:p>
             <w:pPr>
@@ -1375,12 +1129,6 @@
       <w:tr>
         <w:tc>
           <w:tcPr>
-            <w:tcBorders>
-              <w:top w:val="single" w:sz="4" w:space="0" w:color="000000"/>
-              <w:left w:val="single" w:sz="4" w:space="0" w:color="000000"/>
-              <w:bottom w:val="single" w:sz="4" w:space="0" w:color="000000"/>
-              <w:right w:val="single" w:sz="4" w:space="0" w:color="000000"/>
-            </w:tcBorders>
             <w:tcBorders>
               <w:top w:val="single" w:sz="4" w:space="0" w:color="000000"/>
               <w:left w:val="single" w:sz="4" w:space="0" w:color="000000"/>
@@ -1397,41 +1145,29 @@
                 <w:b/>
                 <w:bCs/>
               </w:rPr>
-              <w:t xml:space="preserve">3 - Avanzado</w:t>
-            </w:r>
-          </w:p>
-        </w:tc>
-        <w:tc>
-          <w:tcPr>
-            <w:tcBorders>
-              <w:top w:val="single" w:sz="4" w:space="0" w:color="000000"/>
-              <w:left w:val="single" w:sz="4" w:space="0" w:color="000000"/>
-              <w:bottom w:val="single" w:sz="4" w:space="0" w:color="000000"/>
-              <w:right w:val="single" w:sz="4" w:space="0" w:color="000000"/>
-            </w:tcBorders>
-            <w:tcBorders>
-              <w:top w:val="single" w:sz="4" w:space="0" w:color="000000"/>
-              <w:left w:val="single" w:sz="4" w:space="0" w:color="000000"/>
-              <w:bottom w:val="single" w:sz="4" w:space="0" w:color="000000"/>
-              <w:right w:val="single" w:sz="4" w:space="0" w:color="000000"/>
-            </w:tcBorders>
-          </w:tcPr>
-          <w:p>
-            <w:pPr>
-              <w:pStyle w:val="Compact"/>
-            </w:pPr>
-          </w:p>
-        </w:tc>
-      </w:tr>
-      <w:tr>
-        <w:tc>
-          <w:tcPr>
-            <w:tcBorders>
-              <w:top w:val="single" w:sz="4" w:space="0" w:color="000000"/>
-              <w:left w:val="single" w:sz="4" w:space="0" w:color="000000"/>
-              <w:bottom w:val="single" w:sz="4" w:space="0" w:color="000000"/>
-              <w:right w:val="single" w:sz="4" w:space="0" w:color="000000"/>
-            </w:tcBorders>
+              <w:t xml:space="preserve">4 - Destacado</w:t>
+            </w:r>
+          </w:p>
+        </w:tc>
+        <w:tc>
+          <w:tcPr>
+            <w:tcBorders>
+              <w:top w:val="single" w:sz="4" w:space="0" w:color="000000"/>
+              <w:left w:val="single" w:sz="4" w:space="0" w:color="000000"/>
+              <w:bottom w:val="single" w:sz="4" w:space="0" w:color="000000"/>
+              <w:right w:val="single" w:sz="4" w:space="0" w:color="000000"/>
+            </w:tcBorders>
+          </w:tcPr>
+          <w:p>
+            <w:pPr>
+              <w:pStyle w:val="Compact"/>
+            </w:pPr>
+          </w:p>
+        </w:tc>
+      </w:tr>
+      <w:tr>
+        <w:tc>
+          <w:tcPr>
             <w:tcBorders>
               <w:top w:val="single" w:sz="4" w:space="0" w:color="000000"/>
               <w:left w:val="single" w:sz="4" w:space="0" w:color="000000"/>
@@ -1448,41 +1184,29 @@
                 <w:b/>
                 <w:bCs/>
               </w:rPr>
-              <w:t xml:space="preserve">2 - En desarrollo</w:t>
-            </w:r>
-          </w:p>
-        </w:tc>
-        <w:tc>
-          <w:tcPr>
-            <w:tcBorders>
-              <w:top w:val="single" w:sz="4" w:space="0" w:color="000000"/>
-              <w:left w:val="single" w:sz="4" w:space="0" w:color="000000"/>
-              <w:bottom w:val="single" w:sz="4" w:space="0" w:color="000000"/>
-              <w:right w:val="single" w:sz="4" w:space="0" w:color="000000"/>
-            </w:tcBorders>
-            <w:tcBorders>
-              <w:top w:val="single" w:sz="4" w:space="0" w:color="000000"/>
-              <w:left w:val="single" w:sz="4" w:space="0" w:color="000000"/>
-              <w:bottom w:val="single" w:sz="4" w:space="0" w:color="000000"/>
-              <w:right w:val="single" w:sz="4" w:space="0" w:color="000000"/>
-            </w:tcBorders>
-          </w:tcPr>
-          <w:p>
-            <w:pPr>
-              <w:pStyle w:val="Compact"/>
-            </w:pPr>
-          </w:p>
-        </w:tc>
-      </w:tr>
-      <w:tr>
-        <w:tc>
-          <w:tcPr>
-            <w:tcBorders>
-              <w:top w:val="single" w:sz="4" w:space="0" w:color="000000"/>
-              <w:left w:val="single" w:sz="4" w:space="0" w:color="000000"/>
-              <w:bottom w:val="single" w:sz="4" w:space="0" w:color="000000"/>
-              <w:right w:val="single" w:sz="4" w:space="0" w:color="000000"/>
-            </w:tcBorders>
+              <w:t xml:space="preserve">3 - Sólido</w:t>
+            </w:r>
+          </w:p>
+        </w:tc>
+        <w:tc>
+          <w:tcPr>
+            <w:tcBorders>
+              <w:top w:val="single" w:sz="4" w:space="0" w:color="000000"/>
+              <w:left w:val="single" w:sz="4" w:space="0" w:color="000000"/>
+              <w:bottom w:val="single" w:sz="4" w:space="0" w:color="000000"/>
+              <w:right w:val="single" w:sz="4" w:space="0" w:color="000000"/>
+            </w:tcBorders>
+          </w:tcPr>
+          <w:p>
+            <w:pPr>
+              <w:pStyle w:val="Compact"/>
+            </w:pPr>
+          </w:p>
+        </w:tc>
+      </w:tr>
+      <w:tr>
+        <w:tc>
+          <w:tcPr>
             <w:tcBorders>
               <w:top w:val="single" w:sz="4" w:space="0" w:color="000000"/>
               <w:left w:val="single" w:sz="4" w:space="0" w:color="000000"/>
@@ -1499,41 +1223,29 @@
                 <w:b/>
                 <w:bCs/>
               </w:rPr>
-              <w:t xml:space="preserve">1 - Inicial</w:t>
-            </w:r>
-          </w:p>
-        </w:tc>
-        <w:tc>
-          <w:tcPr>
-            <w:tcBorders>
-              <w:top w:val="single" w:sz="4" w:space="0" w:color="000000"/>
-              <w:left w:val="single" w:sz="4" w:space="0" w:color="000000"/>
-              <w:bottom w:val="single" w:sz="4" w:space="0" w:color="000000"/>
-              <w:right w:val="single" w:sz="4" w:space="0" w:color="000000"/>
-            </w:tcBorders>
-            <w:tcBorders>
-              <w:top w:val="single" w:sz="4" w:space="0" w:color="000000"/>
-              <w:left w:val="single" w:sz="4" w:space="0" w:color="000000"/>
-              <w:bottom w:val="single" w:sz="4" w:space="0" w:color="000000"/>
-              <w:right w:val="single" w:sz="4" w:space="0" w:color="000000"/>
-            </w:tcBorders>
-          </w:tcPr>
-          <w:p>
-            <w:pPr>
-              <w:pStyle w:val="Compact"/>
-            </w:pPr>
-          </w:p>
-        </w:tc>
-      </w:tr>
-      <w:tr>
-        <w:tc>
-          <w:tcPr>
-            <w:tcBorders>
-              <w:top w:val="single" w:sz="4" w:space="0" w:color="000000"/>
-              <w:left w:val="single" w:sz="4" w:space="0" w:color="000000"/>
-              <w:bottom w:val="single" w:sz="4" w:space="0" w:color="000000"/>
-              <w:right w:val="single" w:sz="4" w:space="0" w:color="000000"/>
-            </w:tcBorders>
+              <w:t xml:space="preserve">2 - Básico</w:t>
+            </w:r>
+          </w:p>
+        </w:tc>
+        <w:tc>
+          <w:tcPr>
+            <w:tcBorders>
+              <w:top w:val="single" w:sz="4" w:space="0" w:color="000000"/>
+              <w:left w:val="single" w:sz="4" w:space="0" w:color="000000"/>
+              <w:bottom w:val="single" w:sz="4" w:space="0" w:color="000000"/>
+              <w:right w:val="single" w:sz="4" w:space="0" w:color="000000"/>
+            </w:tcBorders>
+          </w:tcPr>
+          <w:p>
+            <w:pPr>
+              <w:pStyle w:val="Compact"/>
+            </w:pPr>
+          </w:p>
+        </w:tc>
+      </w:tr>
+      <w:tr>
+        <w:tc>
+          <w:tcPr>
             <w:tcBorders>
               <w:top w:val="single" w:sz="4" w:space="0" w:color="000000"/>
               <w:left w:val="single" w:sz="4" w:space="0" w:color="000000"/>
@@ -1550,18 +1262,12 @@
                 <w:b/>
                 <w:bCs/>
               </w:rPr>
-              <w:t xml:space="preserve">0 - No presentado</w:t>
-            </w:r>
-          </w:p>
-        </w:tc>
-        <w:tc>
-          <w:tcPr>
-            <w:tcBorders>
-              <w:top w:val="single" w:sz="4" w:space="0" w:color="000000"/>
-              <w:left w:val="single" w:sz="4" w:space="0" w:color="000000"/>
-              <w:bottom w:val="single" w:sz="4" w:space="0" w:color="000000"/>
-              <w:right w:val="single" w:sz="4" w:space="0" w:color="000000"/>
-            </w:tcBorders>
+              <w:t xml:space="preserve">1 - Incipiente</w:t>
+            </w:r>
+          </w:p>
+        </w:tc>
+        <w:tc>
+          <w:tcPr>
             <w:tcBorders>
               <w:top w:val="single" w:sz="4" w:space="0" w:color="000000"/>
               <w:left w:val="single" w:sz="4" w:space="0" w:color="000000"/>
@@ -1609,12 +1315,6 @@
               <w:bottom w:val="single" w:sz="4" w:space="0" w:color="000000"/>
               <w:right w:val="single" w:sz="4" w:space="0" w:color="000000"/>
             </w:tcBorders>
-            <w:tcBorders>
-              <w:top w:val="single" w:sz="4" w:space="0" w:color="000000"/>
-              <w:left w:val="single" w:sz="4" w:space="0" w:color="000000"/>
-              <w:bottom w:val="single" w:sz="4" w:space="0" w:color="000000"/>
-              <w:right w:val="single" w:sz="4" w:space="0" w:color="000000"/>
-            </w:tcBorders>
           </w:tcPr>
           <w:p>
             <w:pPr>
@@ -1633,12 +1333,6 @@
               <w:bottom w:val="single" w:sz="4" w:space="0" w:color="000000"/>
               <w:right w:val="single" w:sz="4" w:space="0" w:color="000000"/>
             </w:tcBorders>
-            <w:tcBorders>
-              <w:top w:val="single" w:sz="4" w:space="0" w:color="000000"/>
-              <w:left w:val="single" w:sz="4" w:space="0" w:color="000000"/>
-              <w:bottom w:val="single" w:sz="4" w:space="0" w:color="000000"/>
-              <w:right w:val="single" w:sz="4" w:space="0" w:color="000000"/>
-            </w:tcBorders>
           </w:tcPr>
           <w:p>
             <w:pPr>
@@ -1653,12 +1347,6 @@
       <w:tr>
         <w:tc>
           <w:tcPr>
-            <w:tcBorders>
-              <w:top w:val="single" w:sz="4" w:space="0" w:color="000000"/>
-              <w:left w:val="single" w:sz="4" w:space="0" w:color="000000"/>
-              <w:bottom w:val="single" w:sz="4" w:space="0" w:color="000000"/>
-              <w:right w:val="single" w:sz="4" w:space="0" w:color="000000"/>
-            </w:tcBorders>
             <w:tcBorders>
               <w:top w:val="single" w:sz="4" w:space="0" w:color="000000"/>
               <w:left w:val="single" w:sz="4" w:space="0" w:color="000000"/>
@@ -1675,41 +1363,29 @@
                 <w:b/>
                 <w:bCs/>
               </w:rPr>
-              <w:t xml:space="preserve">3 - Avanzado</w:t>
-            </w:r>
-          </w:p>
-        </w:tc>
-        <w:tc>
-          <w:tcPr>
-            <w:tcBorders>
-              <w:top w:val="single" w:sz="4" w:space="0" w:color="000000"/>
-              <w:left w:val="single" w:sz="4" w:space="0" w:color="000000"/>
-              <w:bottom w:val="single" w:sz="4" w:space="0" w:color="000000"/>
-              <w:right w:val="single" w:sz="4" w:space="0" w:color="000000"/>
-            </w:tcBorders>
-            <w:tcBorders>
-              <w:top w:val="single" w:sz="4" w:space="0" w:color="000000"/>
-              <w:left w:val="single" w:sz="4" w:space="0" w:color="000000"/>
-              <w:bottom w:val="single" w:sz="4" w:space="0" w:color="000000"/>
-              <w:right w:val="single" w:sz="4" w:space="0" w:color="000000"/>
-            </w:tcBorders>
-          </w:tcPr>
-          <w:p>
-            <w:pPr>
-              <w:pStyle w:val="Compact"/>
-            </w:pPr>
-          </w:p>
-        </w:tc>
-      </w:tr>
-      <w:tr>
-        <w:tc>
-          <w:tcPr>
-            <w:tcBorders>
-              <w:top w:val="single" w:sz="4" w:space="0" w:color="000000"/>
-              <w:left w:val="single" w:sz="4" w:space="0" w:color="000000"/>
-              <w:bottom w:val="single" w:sz="4" w:space="0" w:color="000000"/>
-              <w:right w:val="single" w:sz="4" w:space="0" w:color="000000"/>
-            </w:tcBorders>
+              <w:t xml:space="preserve">4 - Destacado</w:t>
+            </w:r>
+          </w:p>
+        </w:tc>
+        <w:tc>
+          <w:tcPr>
+            <w:tcBorders>
+              <w:top w:val="single" w:sz="4" w:space="0" w:color="000000"/>
+              <w:left w:val="single" w:sz="4" w:space="0" w:color="000000"/>
+              <w:bottom w:val="single" w:sz="4" w:space="0" w:color="000000"/>
+              <w:right w:val="single" w:sz="4" w:space="0" w:color="000000"/>
+            </w:tcBorders>
+          </w:tcPr>
+          <w:p>
+            <w:pPr>
+              <w:pStyle w:val="Compact"/>
+            </w:pPr>
+          </w:p>
+        </w:tc>
+      </w:tr>
+      <w:tr>
+        <w:tc>
+          <w:tcPr>
             <w:tcBorders>
               <w:top w:val="single" w:sz="4" w:space="0" w:color="000000"/>
               <w:left w:val="single" w:sz="4" w:space="0" w:color="000000"/>
@@ -1726,41 +1402,29 @@
                 <w:b/>
                 <w:bCs/>
               </w:rPr>
-              <w:t xml:space="preserve">2 - En desarrollo</w:t>
-            </w:r>
-          </w:p>
-        </w:tc>
-        <w:tc>
-          <w:tcPr>
-            <w:tcBorders>
-              <w:top w:val="single" w:sz="4" w:space="0" w:color="000000"/>
-              <w:left w:val="single" w:sz="4" w:space="0" w:color="000000"/>
-              <w:bottom w:val="single" w:sz="4" w:space="0" w:color="000000"/>
-              <w:right w:val="single" w:sz="4" w:space="0" w:color="000000"/>
-            </w:tcBorders>
-            <w:tcBorders>
-              <w:top w:val="single" w:sz="4" w:space="0" w:color="000000"/>
-              <w:left w:val="single" w:sz="4" w:space="0" w:color="000000"/>
-              <w:bottom w:val="single" w:sz="4" w:space="0" w:color="000000"/>
-              <w:right w:val="single" w:sz="4" w:space="0" w:color="000000"/>
-            </w:tcBorders>
-          </w:tcPr>
-          <w:p>
-            <w:pPr>
-              <w:pStyle w:val="Compact"/>
-            </w:pPr>
-          </w:p>
-        </w:tc>
-      </w:tr>
-      <w:tr>
-        <w:tc>
-          <w:tcPr>
-            <w:tcBorders>
-              <w:top w:val="single" w:sz="4" w:space="0" w:color="000000"/>
-              <w:left w:val="single" w:sz="4" w:space="0" w:color="000000"/>
-              <w:bottom w:val="single" w:sz="4" w:space="0" w:color="000000"/>
-              <w:right w:val="single" w:sz="4" w:space="0" w:color="000000"/>
-            </w:tcBorders>
+              <w:t xml:space="preserve">3 - Sólido</w:t>
+            </w:r>
+          </w:p>
+        </w:tc>
+        <w:tc>
+          <w:tcPr>
+            <w:tcBorders>
+              <w:top w:val="single" w:sz="4" w:space="0" w:color="000000"/>
+              <w:left w:val="single" w:sz="4" w:space="0" w:color="000000"/>
+              <w:bottom w:val="single" w:sz="4" w:space="0" w:color="000000"/>
+              <w:right w:val="single" w:sz="4" w:space="0" w:color="000000"/>
+            </w:tcBorders>
+          </w:tcPr>
+          <w:p>
+            <w:pPr>
+              <w:pStyle w:val="Compact"/>
+            </w:pPr>
+          </w:p>
+        </w:tc>
+      </w:tr>
+      <w:tr>
+        <w:tc>
+          <w:tcPr>
             <w:tcBorders>
               <w:top w:val="single" w:sz="4" w:space="0" w:color="000000"/>
               <w:left w:val="single" w:sz="4" w:space="0" w:color="000000"/>
@@ -1777,41 +1441,29 @@
                 <w:b/>
                 <w:bCs/>
               </w:rPr>
-              <w:t xml:space="preserve">1 - Inicial</w:t>
-            </w:r>
-          </w:p>
-        </w:tc>
-        <w:tc>
-          <w:tcPr>
-            <w:tcBorders>
-              <w:top w:val="single" w:sz="4" w:space="0" w:color="000000"/>
-              <w:left w:val="single" w:sz="4" w:space="0" w:color="000000"/>
-              <w:bottom w:val="single" w:sz="4" w:space="0" w:color="000000"/>
-              <w:right w:val="single" w:sz="4" w:space="0" w:color="000000"/>
-            </w:tcBorders>
-            <w:tcBorders>
-              <w:top w:val="single" w:sz="4" w:space="0" w:color="000000"/>
-              <w:left w:val="single" w:sz="4" w:space="0" w:color="000000"/>
-              <w:bottom w:val="single" w:sz="4" w:space="0" w:color="000000"/>
-              <w:right w:val="single" w:sz="4" w:space="0" w:color="000000"/>
-            </w:tcBorders>
-          </w:tcPr>
-          <w:p>
-            <w:pPr>
-              <w:pStyle w:val="Compact"/>
-            </w:pPr>
-          </w:p>
-        </w:tc>
-      </w:tr>
-      <w:tr>
-        <w:tc>
-          <w:tcPr>
-            <w:tcBorders>
-              <w:top w:val="single" w:sz="4" w:space="0" w:color="000000"/>
-              <w:left w:val="single" w:sz="4" w:space="0" w:color="000000"/>
-              <w:bottom w:val="single" w:sz="4" w:space="0" w:color="000000"/>
-              <w:right w:val="single" w:sz="4" w:space="0" w:color="000000"/>
-            </w:tcBorders>
+              <w:t xml:space="preserve">2 - Básico</w:t>
+            </w:r>
+          </w:p>
+        </w:tc>
+        <w:tc>
+          <w:tcPr>
+            <w:tcBorders>
+              <w:top w:val="single" w:sz="4" w:space="0" w:color="000000"/>
+              <w:left w:val="single" w:sz="4" w:space="0" w:color="000000"/>
+              <w:bottom w:val="single" w:sz="4" w:space="0" w:color="000000"/>
+              <w:right w:val="single" w:sz="4" w:space="0" w:color="000000"/>
+            </w:tcBorders>
+          </w:tcPr>
+          <w:p>
+            <w:pPr>
+              <w:pStyle w:val="Compact"/>
+            </w:pPr>
+          </w:p>
+        </w:tc>
+      </w:tr>
+      <w:tr>
+        <w:tc>
+          <w:tcPr>
             <w:tcBorders>
               <w:top w:val="single" w:sz="4" w:space="0" w:color="000000"/>
               <w:left w:val="single" w:sz="4" w:space="0" w:color="000000"/>
@@ -1828,18 +1480,12 @@
                 <w:b/>
                 <w:bCs/>
               </w:rPr>
-              <w:t xml:space="preserve">0 - No presentado</w:t>
-            </w:r>
-          </w:p>
-        </w:tc>
-        <w:tc>
-          <w:tcPr>
-            <w:tcBorders>
-              <w:top w:val="single" w:sz="4" w:space="0" w:color="000000"/>
-              <w:left w:val="single" w:sz="4" w:space="0" w:color="000000"/>
-              <w:bottom w:val="single" w:sz="4" w:space="0" w:color="000000"/>
-              <w:right w:val="single" w:sz="4" w:space="0" w:color="000000"/>
-            </w:tcBorders>
+              <w:t xml:space="preserve">1 - Incipiente</w:t>
+            </w:r>
+          </w:p>
+        </w:tc>
+        <w:tc>
+          <w:tcPr>
             <w:tcBorders>
               <w:top w:val="single" w:sz="4" w:space="0" w:color="000000"/>
               <w:left w:val="single" w:sz="4" w:space="0" w:color="000000"/>
@@ -1887,12 +1533,6 @@
               <w:bottom w:val="single" w:sz="4" w:space="0" w:color="000000"/>
               <w:right w:val="single" w:sz="4" w:space="0" w:color="000000"/>
             </w:tcBorders>
-            <w:tcBorders>
-              <w:top w:val="single" w:sz="4" w:space="0" w:color="000000"/>
-              <w:left w:val="single" w:sz="4" w:space="0" w:color="000000"/>
-              <w:bottom w:val="single" w:sz="4" w:space="0" w:color="000000"/>
-              <w:right w:val="single" w:sz="4" w:space="0" w:color="000000"/>
-            </w:tcBorders>
           </w:tcPr>
           <w:p>
             <w:pPr>
@@ -1911,12 +1551,6 @@
               <w:bottom w:val="single" w:sz="4" w:space="0" w:color="000000"/>
               <w:right w:val="single" w:sz="4" w:space="0" w:color="000000"/>
             </w:tcBorders>
-            <w:tcBorders>
-              <w:top w:val="single" w:sz="4" w:space="0" w:color="000000"/>
-              <w:left w:val="single" w:sz="4" w:space="0" w:color="000000"/>
-              <w:bottom w:val="single" w:sz="4" w:space="0" w:color="000000"/>
-              <w:right w:val="single" w:sz="4" w:space="0" w:color="000000"/>
-            </w:tcBorders>
           </w:tcPr>
           <w:p>
             <w:pPr>
@@ -1931,12 +1565,6 @@
       <w:tr>
         <w:tc>
           <w:tcPr>
-            <w:tcBorders>
-              <w:top w:val="single" w:sz="4" w:space="0" w:color="000000"/>
-              <w:left w:val="single" w:sz="4" w:space="0" w:color="000000"/>
-              <w:bottom w:val="single" w:sz="4" w:space="0" w:color="000000"/>
-              <w:right w:val="single" w:sz="4" w:space="0" w:color="000000"/>
-            </w:tcBorders>
             <w:tcBorders>
               <w:top w:val="single" w:sz="4" w:space="0" w:color="000000"/>
               <w:left w:val="single" w:sz="4" w:space="0" w:color="000000"/>
@@ -1953,41 +1581,29 @@
                 <w:b/>
                 <w:bCs/>
               </w:rPr>
-              <w:t xml:space="preserve">3 - Avanzado</w:t>
-            </w:r>
-          </w:p>
-        </w:tc>
-        <w:tc>
-          <w:tcPr>
-            <w:tcBorders>
-              <w:top w:val="single" w:sz="4" w:space="0" w:color="000000"/>
-              <w:left w:val="single" w:sz="4" w:space="0" w:color="000000"/>
-              <w:bottom w:val="single" w:sz="4" w:space="0" w:color="000000"/>
-              <w:right w:val="single" w:sz="4" w:space="0" w:color="000000"/>
-            </w:tcBorders>
-            <w:tcBorders>
-              <w:top w:val="single" w:sz="4" w:space="0" w:color="000000"/>
-              <w:left w:val="single" w:sz="4" w:space="0" w:color="000000"/>
-              <w:bottom w:val="single" w:sz="4" w:space="0" w:color="000000"/>
-              <w:right w:val="single" w:sz="4" w:space="0" w:color="000000"/>
-            </w:tcBorders>
-          </w:tcPr>
-          <w:p>
-            <w:pPr>
-              <w:pStyle w:val="Compact"/>
-            </w:pPr>
-          </w:p>
-        </w:tc>
-      </w:tr>
-      <w:tr>
-        <w:tc>
-          <w:tcPr>
-            <w:tcBorders>
-              <w:top w:val="single" w:sz="4" w:space="0" w:color="000000"/>
-              <w:left w:val="single" w:sz="4" w:space="0" w:color="000000"/>
-              <w:bottom w:val="single" w:sz="4" w:space="0" w:color="000000"/>
-              <w:right w:val="single" w:sz="4" w:space="0" w:color="000000"/>
-            </w:tcBorders>
+              <w:t xml:space="preserve">4 - Destacado</w:t>
+            </w:r>
+          </w:p>
+        </w:tc>
+        <w:tc>
+          <w:tcPr>
+            <w:tcBorders>
+              <w:top w:val="single" w:sz="4" w:space="0" w:color="000000"/>
+              <w:left w:val="single" w:sz="4" w:space="0" w:color="000000"/>
+              <w:bottom w:val="single" w:sz="4" w:space="0" w:color="000000"/>
+              <w:right w:val="single" w:sz="4" w:space="0" w:color="000000"/>
+            </w:tcBorders>
+          </w:tcPr>
+          <w:p>
+            <w:pPr>
+              <w:pStyle w:val="Compact"/>
+            </w:pPr>
+          </w:p>
+        </w:tc>
+      </w:tr>
+      <w:tr>
+        <w:tc>
+          <w:tcPr>
             <w:tcBorders>
               <w:top w:val="single" w:sz="4" w:space="0" w:color="000000"/>
               <w:left w:val="single" w:sz="4" w:space="0" w:color="000000"/>
@@ -2004,41 +1620,29 @@
                 <w:b/>
                 <w:bCs/>
               </w:rPr>
-              <w:t xml:space="preserve">2 - En desarrollo</w:t>
-            </w:r>
-          </w:p>
-        </w:tc>
-        <w:tc>
-          <w:tcPr>
-            <w:tcBorders>
-              <w:top w:val="single" w:sz="4" w:space="0" w:color="000000"/>
-              <w:left w:val="single" w:sz="4" w:space="0" w:color="000000"/>
-              <w:bottom w:val="single" w:sz="4" w:space="0" w:color="000000"/>
-              <w:right w:val="single" w:sz="4" w:space="0" w:color="000000"/>
-            </w:tcBorders>
-            <w:tcBorders>
-              <w:top w:val="single" w:sz="4" w:space="0" w:color="000000"/>
-              <w:left w:val="single" w:sz="4" w:space="0" w:color="000000"/>
-              <w:bottom w:val="single" w:sz="4" w:space="0" w:color="000000"/>
-              <w:right w:val="single" w:sz="4" w:space="0" w:color="000000"/>
-            </w:tcBorders>
-          </w:tcPr>
-          <w:p>
-            <w:pPr>
-              <w:pStyle w:val="Compact"/>
-            </w:pPr>
-          </w:p>
-        </w:tc>
-      </w:tr>
-      <w:tr>
-        <w:tc>
-          <w:tcPr>
-            <w:tcBorders>
-              <w:top w:val="single" w:sz="4" w:space="0" w:color="000000"/>
-              <w:left w:val="single" w:sz="4" w:space="0" w:color="000000"/>
-              <w:bottom w:val="single" w:sz="4" w:space="0" w:color="000000"/>
-              <w:right w:val="single" w:sz="4" w:space="0" w:color="000000"/>
-            </w:tcBorders>
+              <w:t xml:space="preserve">3 - Sólido</w:t>
+            </w:r>
+          </w:p>
+        </w:tc>
+        <w:tc>
+          <w:tcPr>
+            <w:tcBorders>
+              <w:top w:val="single" w:sz="4" w:space="0" w:color="000000"/>
+              <w:left w:val="single" w:sz="4" w:space="0" w:color="000000"/>
+              <w:bottom w:val="single" w:sz="4" w:space="0" w:color="000000"/>
+              <w:right w:val="single" w:sz="4" w:space="0" w:color="000000"/>
+            </w:tcBorders>
+          </w:tcPr>
+          <w:p>
+            <w:pPr>
+              <w:pStyle w:val="Compact"/>
+            </w:pPr>
+          </w:p>
+        </w:tc>
+      </w:tr>
+      <w:tr>
+        <w:tc>
+          <w:tcPr>
             <w:tcBorders>
               <w:top w:val="single" w:sz="4" w:space="0" w:color="000000"/>
               <w:left w:val="single" w:sz="4" w:space="0" w:color="000000"/>
@@ -2055,41 +1659,29 @@
                 <w:b/>
                 <w:bCs/>
               </w:rPr>
-              <w:t xml:space="preserve">1 - Inicial</w:t>
-            </w:r>
-          </w:p>
-        </w:tc>
-        <w:tc>
-          <w:tcPr>
-            <w:tcBorders>
-              <w:top w:val="single" w:sz="4" w:space="0" w:color="000000"/>
-              <w:left w:val="single" w:sz="4" w:space="0" w:color="000000"/>
-              <w:bottom w:val="single" w:sz="4" w:space="0" w:color="000000"/>
-              <w:right w:val="single" w:sz="4" w:space="0" w:color="000000"/>
-            </w:tcBorders>
-            <w:tcBorders>
-              <w:top w:val="single" w:sz="4" w:space="0" w:color="000000"/>
-              <w:left w:val="single" w:sz="4" w:space="0" w:color="000000"/>
-              <w:bottom w:val="single" w:sz="4" w:space="0" w:color="000000"/>
-              <w:right w:val="single" w:sz="4" w:space="0" w:color="000000"/>
-            </w:tcBorders>
-          </w:tcPr>
-          <w:p>
-            <w:pPr>
-              <w:pStyle w:val="Compact"/>
-            </w:pPr>
-          </w:p>
-        </w:tc>
-      </w:tr>
-      <w:tr>
-        <w:tc>
-          <w:tcPr>
-            <w:tcBorders>
-              <w:top w:val="single" w:sz="4" w:space="0" w:color="000000"/>
-              <w:left w:val="single" w:sz="4" w:space="0" w:color="000000"/>
-              <w:bottom w:val="single" w:sz="4" w:space="0" w:color="000000"/>
-              <w:right w:val="single" w:sz="4" w:space="0" w:color="000000"/>
-            </w:tcBorders>
+              <w:t xml:space="preserve">2 - Básico</w:t>
+            </w:r>
+          </w:p>
+        </w:tc>
+        <w:tc>
+          <w:tcPr>
+            <w:tcBorders>
+              <w:top w:val="single" w:sz="4" w:space="0" w:color="000000"/>
+              <w:left w:val="single" w:sz="4" w:space="0" w:color="000000"/>
+              <w:bottom w:val="single" w:sz="4" w:space="0" w:color="000000"/>
+              <w:right w:val="single" w:sz="4" w:space="0" w:color="000000"/>
+            </w:tcBorders>
+          </w:tcPr>
+          <w:p>
+            <w:pPr>
+              <w:pStyle w:val="Compact"/>
+            </w:pPr>
+          </w:p>
+        </w:tc>
+      </w:tr>
+      <w:tr>
+        <w:tc>
+          <w:tcPr>
             <w:tcBorders>
               <w:top w:val="single" w:sz="4" w:space="0" w:color="000000"/>
               <w:left w:val="single" w:sz="4" w:space="0" w:color="000000"/>
@@ -2106,18 +1698,12 @@
                 <w:b/>
                 <w:bCs/>
               </w:rPr>
-              <w:t xml:space="preserve">0 - No presentado</w:t>
-            </w:r>
-          </w:p>
-        </w:tc>
-        <w:tc>
-          <w:tcPr>
-            <w:tcBorders>
-              <w:top w:val="single" w:sz="4" w:space="0" w:color="000000"/>
-              <w:left w:val="single" w:sz="4" w:space="0" w:color="000000"/>
-              <w:bottom w:val="single" w:sz="4" w:space="0" w:color="000000"/>
-              <w:right w:val="single" w:sz="4" w:space="0" w:color="000000"/>
-            </w:tcBorders>
+              <w:t xml:space="preserve">1 - Incipiente</w:t>
+            </w:r>
+          </w:p>
+        </w:tc>
+        <w:tc>
+          <w:tcPr>
             <w:tcBorders>
               <w:top w:val="single" w:sz="4" w:space="0" w:color="000000"/>
               <w:left w:val="single" w:sz="4" w:space="0" w:color="000000"/>
@@ -2167,12 +1753,6 @@
               <w:bottom w:val="single" w:sz="4" w:space="0" w:color="000000"/>
               <w:right w:val="single" w:sz="4" w:space="0" w:color="000000"/>
             </w:tcBorders>
-            <w:tcBorders>
-              <w:top w:val="single" w:sz="4" w:space="0" w:color="000000"/>
-              <w:left w:val="single" w:sz="4" w:space="0" w:color="000000"/>
-              <w:bottom w:val="single" w:sz="4" w:space="0" w:color="000000"/>
-              <w:right w:val="single" w:sz="4" w:space="0" w:color="000000"/>
-            </w:tcBorders>
           </w:tcPr>
           <w:p>
             <w:pPr>
@@ -2191,12 +1771,6 @@
               <w:bottom w:val="single" w:sz="4" w:space="0" w:color="000000"/>
               <w:right w:val="single" w:sz="4" w:space="0" w:color="000000"/>
             </w:tcBorders>
-            <w:tcBorders>
-              <w:top w:val="single" w:sz="4" w:space="0" w:color="000000"/>
-              <w:left w:val="single" w:sz="4" w:space="0" w:color="000000"/>
-              <w:bottom w:val="single" w:sz="4" w:space="0" w:color="000000"/>
-              <w:right w:val="single" w:sz="4" w:space="0" w:color="000000"/>
-            </w:tcBorders>
           </w:tcPr>
           <w:p>
             <w:pPr>
@@ -2217,12 +1791,6 @@
               <w:bottom w:val="single" w:sz="4" w:space="0" w:color="000000"/>
               <w:right w:val="single" w:sz="4" w:space="0" w:color="000000"/>
             </w:tcBorders>
-            <w:tcBorders>
-              <w:top w:val="single" w:sz="4" w:space="0" w:color="000000"/>
-              <w:left w:val="single" w:sz="4" w:space="0" w:color="000000"/>
-              <w:bottom w:val="single" w:sz="4" w:space="0" w:color="000000"/>
-              <w:right w:val="single" w:sz="4" w:space="0" w:color="000000"/>
-            </w:tcBorders>
           </w:tcPr>
           <w:p>
             <w:pPr>
@@ -2241,29 +1809,17 @@
               <w:bottom w:val="single" w:sz="4" w:space="0" w:color="000000"/>
               <w:right w:val="single" w:sz="4" w:space="0" w:color="000000"/>
             </w:tcBorders>
-            <w:tcBorders>
-              <w:top w:val="single" w:sz="4" w:space="0" w:color="000000"/>
-              <w:left w:val="single" w:sz="4" w:space="0" w:color="000000"/>
-              <w:bottom w:val="single" w:sz="4" w:space="0" w:color="000000"/>
-              <w:right w:val="single" w:sz="4" w:space="0" w:color="000000"/>
-            </w:tcBorders>
-          </w:tcPr>
-          <w:p>
-            <w:pPr>
-              <w:pStyle w:val="Compact"/>
-            </w:pPr>
-          </w:p>
-        </w:tc>
-      </w:tr>
-      <w:tr>
-        <w:tc>
-          <w:tcPr>
-            <w:tcBorders>
-              <w:top w:val="single" w:sz="4" w:space="0" w:color="000000"/>
-              <w:left w:val="single" w:sz="4" w:space="0" w:color="000000"/>
-              <w:bottom w:val="single" w:sz="4" w:space="0" w:color="000000"/>
-              <w:right w:val="single" w:sz="4" w:space="0" w:color="000000"/>
-            </w:tcBorders>
+          </w:tcPr>
+          <w:p>
+            <w:pPr>
+              <w:pStyle w:val="Compact"/>
+            </w:pPr>
+          </w:p>
+        </w:tc>
+      </w:tr>
+      <w:tr>
+        <w:tc>
+          <w:tcPr>
             <w:tcBorders>
               <w:top w:val="single" w:sz="4" w:space="0" w:color="000000"/>
               <w:left w:val="single" w:sz="4" w:space="0" w:color="000000"/>
@@ -2288,29 +1844,17 @@
               <w:bottom w:val="single" w:sz="4" w:space="0" w:color="000000"/>
               <w:right w:val="single" w:sz="4" w:space="0" w:color="000000"/>
             </w:tcBorders>
-            <w:tcBorders>
-              <w:top w:val="single" w:sz="4" w:space="0" w:color="000000"/>
-              <w:left w:val="single" w:sz="4" w:space="0" w:color="000000"/>
-              <w:bottom w:val="single" w:sz="4" w:space="0" w:color="000000"/>
-              <w:right w:val="single" w:sz="4" w:space="0" w:color="000000"/>
-            </w:tcBorders>
-          </w:tcPr>
-          <w:p>
-            <w:pPr>
-              <w:pStyle w:val="Compact"/>
-            </w:pPr>
-          </w:p>
-        </w:tc>
-      </w:tr>
-      <w:tr>
-        <w:tc>
-          <w:tcPr>
-            <w:tcBorders>
-              <w:top w:val="single" w:sz="4" w:space="0" w:color="000000"/>
-              <w:left w:val="single" w:sz="4" w:space="0" w:color="000000"/>
-              <w:bottom w:val="single" w:sz="4" w:space="0" w:color="000000"/>
-              <w:right w:val="single" w:sz="4" w:space="0" w:color="000000"/>
-            </w:tcBorders>
+          </w:tcPr>
+          <w:p>
+            <w:pPr>
+              <w:pStyle w:val="Compact"/>
+            </w:pPr>
+          </w:p>
+        </w:tc>
+      </w:tr>
+      <w:tr>
+        <w:tc>
+          <w:tcPr>
             <w:tcBorders>
               <w:top w:val="single" w:sz="4" w:space="0" w:color="000000"/>
               <w:left w:val="single" w:sz="4" w:space="0" w:color="000000"/>
@@ -2335,29 +1879,17 @@
               <w:bottom w:val="single" w:sz="4" w:space="0" w:color="000000"/>
               <w:right w:val="single" w:sz="4" w:space="0" w:color="000000"/>
             </w:tcBorders>
-            <w:tcBorders>
-              <w:top w:val="single" w:sz="4" w:space="0" w:color="000000"/>
-              <w:left w:val="single" w:sz="4" w:space="0" w:color="000000"/>
-              <w:bottom w:val="single" w:sz="4" w:space="0" w:color="000000"/>
-              <w:right w:val="single" w:sz="4" w:space="0" w:color="000000"/>
-            </w:tcBorders>
-          </w:tcPr>
-          <w:p>
-            <w:pPr>
-              <w:pStyle w:val="Compact"/>
-            </w:pPr>
-          </w:p>
-        </w:tc>
-      </w:tr>
-      <w:tr>
-        <w:tc>
-          <w:tcPr>
-            <w:tcBorders>
-              <w:top w:val="single" w:sz="4" w:space="0" w:color="000000"/>
-              <w:left w:val="single" w:sz="4" w:space="0" w:color="000000"/>
-              <w:bottom w:val="single" w:sz="4" w:space="0" w:color="000000"/>
-              <w:right w:val="single" w:sz="4" w:space="0" w:color="000000"/>
-            </w:tcBorders>
+          </w:tcPr>
+          <w:p>
+            <w:pPr>
+              <w:pStyle w:val="Compact"/>
+            </w:pPr>
+          </w:p>
+        </w:tc>
+      </w:tr>
+      <w:tr>
+        <w:tc>
+          <w:tcPr>
             <w:tcBorders>
               <w:top w:val="single" w:sz="4" w:space="0" w:color="000000"/>
               <w:left w:val="single" w:sz="4" w:space="0" w:color="000000"/>
@@ -2382,29 +1914,17 @@
               <w:bottom w:val="single" w:sz="4" w:space="0" w:color="000000"/>
               <w:right w:val="single" w:sz="4" w:space="0" w:color="000000"/>
             </w:tcBorders>
-            <w:tcBorders>
-              <w:top w:val="single" w:sz="4" w:space="0" w:color="000000"/>
-              <w:left w:val="single" w:sz="4" w:space="0" w:color="000000"/>
-              <w:bottom w:val="single" w:sz="4" w:space="0" w:color="000000"/>
-              <w:right w:val="single" w:sz="4" w:space="0" w:color="000000"/>
-            </w:tcBorders>
-          </w:tcPr>
-          <w:p>
-            <w:pPr>
-              <w:pStyle w:val="Compact"/>
-            </w:pPr>
-          </w:p>
-        </w:tc>
-      </w:tr>
-      <w:tr>
-        <w:tc>
-          <w:tcPr>
-            <w:tcBorders>
-              <w:top w:val="single" w:sz="4" w:space="0" w:color="000000"/>
-              <w:left w:val="single" w:sz="4" w:space="0" w:color="000000"/>
-              <w:bottom w:val="single" w:sz="4" w:space="0" w:color="000000"/>
-              <w:right w:val="single" w:sz="4" w:space="0" w:color="000000"/>
-            </w:tcBorders>
+          </w:tcPr>
+          <w:p>
+            <w:pPr>
+              <w:pStyle w:val="Compact"/>
+            </w:pPr>
+          </w:p>
+        </w:tc>
+      </w:tr>
+      <w:tr>
+        <w:tc>
+          <w:tcPr>
             <w:tcBorders>
               <w:top w:val="single" w:sz="4" w:space="0" w:color="000000"/>
               <w:left w:val="single" w:sz="4" w:space="0" w:color="000000"/>
@@ -2427,12 +1947,6 @@
         </w:tc>
         <w:tc>
           <w:tcPr>
-            <w:tcBorders>
-              <w:top w:val="single" w:sz="4" w:space="0" w:color="000000"/>
-              <w:left w:val="single" w:sz="4" w:space="0" w:color="000000"/>
-              <w:bottom w:val="single" w:sz="4" w:space="0" w:color="000000"/>
-              <w:right w:val="single" w:sz="4" w:space="0" w:color="000000"/>
-            </w:tcBorders>
             <w:tcBorders>
               <w:top w:val="single" w:sz="4" w:space="0" w:color="000000"/>
               <w:left w:val="single" w:sz="4" w:space="0" w:color="000000"/>
@@ -2521,12 +2035,6 @@
               <w:bottom w:val="single" w:sz="4" w:space="0" w:color="000000"/>
               <w:right w:val="single" w:sz="4" w:space="0" w:color="000000"/>
             </w:tcBorders>
-            <w:tcBorders>
-              <w:top w:val="single" w:sz="4" w:space="0" w:color="000000"/>
-              <w:left w:val="single" w:sz="4" w:space="0" w:color="000000"/>
-              <w:bottom w:val="single" w:sz="4" w:space="0" w:color="000000"/>
-              <w:right w:val="single" w:sz="4" w:space="0" w:color="000000"/>
-            </w:tcBorders>
           </w:tcPr>
           <w:p>
             <w:pPr>
@@ -2545,12 +2053,6 @@
               <w:bottom w:val="single" w:sz="4" w:space="0" w:color="000000"/>
               <w:right w:val="single" w:sz="4" w:space="0" w:color="000000"/>
             </w:tcBorders>
-            <w:tcBorders>
-              <w:top w:val="single" w:sz="4" w:space="0" w:color="000000"/>
-              <w:left w:val="single" w:sz="4" w:space="0" w:color="000000"/>
-              <w:bottom w:val="single" w:sz="4" w:space="0" w:color="000000"/>
-              <w:right w:val="single" w:sz="4" w:space="0" w:color="000000"/>
-            </w:tcBorders>
           </w:tcPr>
           <w:p>
             <w:pPr>
@@ -2569,12 +2071,6 @@
               <w:bottom w:val="single" w:sz="4" w:space="0" w:color="000000"/>
               <w:right w:val="single" w:sz="4" w:space="0" w:color="000000"/>
             </w:tcBorders>
-            <w:tcBorders>
-              <w:top w:val="single" w:sz="4" w:space="0" w:color="000000"/>
-              <w:left w:val="single" w:sz="4" w:space="0" w:color="000000"/>
-              <w:bottom w:val="single" w:sz="4" w:space="0" w:color="000000"/>
-              <w:right w:val="single" w:sz="4" w:space="0" w:color="000000"/>
-            </w:tcBorders>
           </w:tcPr>
           <w:p>
             <w:pPr>
@@ -2593,12 +2089,6 @@
               <w:bottom w:val="single" w:sz="4" w:space="0" w:color="000000"/>
               <w:right w:val="single" w:sz="4" w:space="0" w:color="000000"/>
             </w:tcBorders>
-            <w:tcBorders>
-              <w:top w:val="single" w:sz="4" w:space="0" w:color="000000"/>
-              <w:left w:val="single" w:sz="4" w:space="0" w:color="000000"/>
-              <w:bottom w:val="single" w:sz="4" w:space="0" w:color="000000"/>
-              <w:right w:val="single" w:sz="4" w:space="0" w:color="000000"/>
-            </w:tcBorders>
           </w:tcPr>
           <w:p>
             <w:pPr>
@@ -2619,241 +2109,169 @@
               <w:bottom w:val="single" w:sz="4" w:space="0" w:color="000000"/>
               <w:right w:val="single" w:sz="4" w:space="0" w:color="000000"/>
             </w:tcBorders>
-            <w:tcBorders>
-              <w:top w:val="single" w:sz="4" w:space="0" w:color="000000"/>
-              <w:left w:val="single" w:sz="4" w:space="0" w:color="000000"/>
-              <w:bottom w:val="single" w:sz="4" w:space="0" w:color="000000"/>
-              <w:right w:val="single" w:sz="4" w:space="0" w:color="000000"/>
-            </w:tcBorders>
-          </w:tcPr>
-          <w:p>
-            <w:pPr>
-              <w:pStyle w:val="Compact"/>
-            </w:pPr>
-          </w:p>
-        </w:tc>
-        <w:tc>
-          <w:tcPr>
-            <w:tcBorders>
-              <w:top w:val="single" w:sz="4" w:space="0" w:color="000000"/>
-              <w:left w:val="single" w:sz="4" w:space="0" w:color="000000"/>
-              <w:bottom w:val="single" w:sz="4" w:space="0" w:color="000000"/>
-              <w:right w:val="single" w:sz="4" w:space="0" w:color="000000"/>
-            </w:tcBorders>
-            <w:tcBorders>
-              <w:top w:val="single" w:sz="4" w:space="0" w:color="000000"/>
-              <w:left w:val="single" w:sz="4" w:space="0" w:color="000000"/>
-              <w:bottom w:val="single" w:sz="4" w:space="0" w:color="000000"/>
-              <w:right w:val="single" w:sz="4" w:space="0" w:color="000000"/>
-            </w:tcBorders>
-          </w:tcPr>
-          <w:p>
-            <w:pPr>
-              <w:pStyle w:val="Compact"/>
-            </w:pPr>
-          </w:p>
-        </w:tc>
-        <w:tc>
-          <w:tcPr>
-            <w:tcBorders>
-              <w:top w:val="single" w:sz="4" w:space="0" w:color="000000"/>
-              <w:left w:val="single" w:sz="4" w:space="0" w:color="000000"/>
-              <w:bottom w:val="single" w:sz="4" w:space="0" w:color="000000"/>
-              <w:right w:val="single" w:sz="4" w:space="0" w:color="000000"/>
-            </w:tcBorders>
-            <w:tcBorders>
-              <w:top w:val="single" w:sz="4" w:space="0" w:color="000000"/>
-              <w:left w:val="single" w:sz="4" w:space="0" w:color="000000"/>
-              <w:bottom w:val="single" w:sz="4" w:space="0" w:color="000000"/>
-              <w:right w:val="single" w:sz="4" w:space="0" w:color="000000"/>
-            </w:tcBorders>
-          </w:tcPr>
-          <w:p>
-            <w:pPr>
-              <w:pStyle w:val="Compact"/>
-            </w:pPr>
-          </w:p>
-        </w:tc>
-        <w:tc>
-          <w:tcPr>
-            <w:tcBorders>
-              <w:top w:val="single" w:sz="4" w:space="0" w:color="000000"/>
-              <w:left w:val="single" w:sz="4" w:space="0" w:color="000000"/>
-              <w:bottom w:val="single" w:sz="4" w:space="0" w:color="000000"/>
-              <w:right w:val="single" w:sz="4" w:space="0" w:color="000000"/>
-            </w:tcBorders>
-            <w:tcBorders>
-              <w:top w:val="single" w:sz="4" w:space="0" w:color="000000"/>
-              <w:left w:val="single" w:sz="4" w:space="0" w:color="000000"/>
-              <w:bottom w:val="single" w:sz="4" w:space="0" w:color="000000"/>
-              <w:right w:val="single" w:sz="4" w:space="0" w:color="000000"/>
-            </w:tcBorders>
-          </w:tcPr>
-          <w:p>
-            <w:pPr>
-              <w:pStyle w:val="Compact"/>
-            </w:pPr>
-          </w:p>
-        </w:tc>
-      </w:tr>
-      <w:tr>
-        <w:tc>
-          <w:tcPr>
-            <w:tcBorders>
-              <w:top w:val="single" w:sz="4" w:space="0" w:color="000000"/>
-              <w:left w:val="single" w:sz="4" w:space="0" w:color="000000"/>
-              <w:bottom w:val="single" w:sz="4" w:space="0" w:color="000000"/>
-              <w:right w:val="single" w:sz="4" w:space="0" w:color="000000"/>
-            </w:tcBorders>
-            <w:tcBorders>
-              <w:top w:val="single" w:sz="4" w:space="0" w:color="000000"/>
-              <w:left w:val="single" w:sz="4" w:space="0" w:color="000000"/>
-              <w:bottom w:val="single" w:sz="4" w:space="0" w:color="000000"/>
-              <w:right w:val="single" w:sz="4" w:space="0" w:color="000000"/>
-            </w:tcBorders>
-          </w:tcPr>
-          <w:p>
-            <w:pPr>
-              <w:pStyle w:val="Compact"/>
-            </w:pPr>
-          </w:p>
-        </w:tc>
-        <w:tc>
-          <w:tcPr>
-            <w:tcBorders>
-              <w:top w:val="single" w:sz="4" w:space="0" w:color="000000"/>
-              <w:left w:val="single" w:sz="4" w:space="0" w:color="000000"/>
-              <w:bottom w:val="single" w:sz="4" w:space="0" w:color="000000"/>
-              <w:right w:val="single" w:sz="4" w:space="0" w:color="000000"/>
-            </w:tcBorders>
-            <w:tcBorders>
-              <w:top w:val="single" w:sz="4" w:space="0" w:color="000000"/>
-              <w:left w:val="single" w:sz="4" w:space="0" w:color="000000"/>
-              <w:bottom w:val="single" w:sz="4" w:space="0" w:color="000000"/>
-              <w:right w:val="single" w:sz="4" w:space="0" w:color="000000"/>
-            </w:tcBorders>
-          </w:tcPr>
-          <w:p>
-            <w:pPr>
-              <w:pStyle w:val="Compact"/>
-            </w:pPr>
-          </w:p>
-        </w:tc>
-        <w:tc>
-          <w:tcPr>
-            <w:tcBorders>
-              <w:top w:val="single" w:sz="4" w:space="0" w:color="000000"/>
-              <w:left w:val="single" w:sz="4" w:space="0" w:color="000000"/>
-              <w:bottom w:val="single" w:sz="4" w:space="0" w:color="000000"/>
-              <w:right w:val="single" w:sz="4" w:space="0" w:color="000000"/>
-            </w:tcBorders>
-            <w:tcBorders>
-              <w:top w:val="single" w:sz="4" w:space="0" w:color="000000"/>
-              <w:left w:val="single" w:sz="4" w:space="0" w:color="000000"/>
-              <w:bottom w:val="single" w:sz="4" w:space="0" w:color="000000"/>
-              <w:right w:val="single" w:sz="4" w:space="0" w:color="000000"/>
-            </w:tcBorders>
-          </w:tcPr>
-          <w:p>
-            <w:pPr>
-              <w:pStyle w:val="Compact"/>
-            </w:pPr>
-          </w:p>
-        </w:tc>
-        <w:tc>
-          <w:tcPr>
-            <w:tcBorders>
-              <w:top w:val="single" w:sz="4" w:space="0" w:color="000000"/>
-              <w:left w:val="single" w:sz="4" w:space="0" w:color="000000"/>
-              <w:bottom w:val="single" w:sz="4" w:space="0" w:color="000000"/>
-              <w:right w:val="single" w:sz="4" w:space="0" w:color="000000"/>
-            </w:tcBorders>
-            <w:tcBorders>
-              <w:top w:val="single" w:sz="4" w:space="0" w:color="000000"/>
-              <w:left w:val="single" w:sz="4" w:space="0" w:color="000000"/>
-              <w:bottom w:val="single" w:sz="4" w:space="0" w:color="000000"/>
-              <w:right w:val="single" w:sz="4" w:space="0" w:color="000000"/>
-            </w:tcBorders>
-          </w:tcPr>
-          <w:p>
-            <w:pPr>
-              <w:pStyle w:val="Compact"/>
-            </w:pPr>
-          </w:p>
-        </w:tc>
-      </w:tr>
-      <w:tr>
-        <w:tc>
-          <w:tcPr>
-            <w:tcBorders>
-              <w:top w:val="single" w:sz="4" w:space="0" w:color="000000"/>
-              <w:left w:val="single" w:sz="4" w:space="0" w:color="000000"/>
-              <w:bottom w:val="single" w:sz="4" w:space="0" w:color="000000"/>
-              <w:right w:val="single" w:sz="4" w:space="0" w:color="000000"/>
-            </w:tcBorders>
-            <w:tcBorders>
-              <w:top w:val="single" w:sz="4" w:space="0" w:color="000000"/>
-              <w:left w:val="single" w:sz="4" w:space="0" w:color="000000"/>
-              <w:bottom w:val="single" w:sz="4" w:space="0" w:color="000000"/>
-              <w:right w:val="single" w:sz="4" w:space="0" w:color="000000"/>
-            </w:tcBorders>
-          </w:tcPr>
-          <w:p>
-            <w:pPr>
-              <w:pStyle w:val="Compact"/>
-            </w:pPr>
-          </w:p>
-        </w:tc>
-        <w:tc>
-          <w:tcPr>
-            <w:tcBorders>
-              <w:top w:val="single" w:sz="4" w:space="0" w:color="000000"/>
-              <w:left w:val="single" w:sz="4" w:space="0" w:color="000000"/>
-              <w:bottom w:val="single" w:sz="4" w:space="0" w:color="000000"/>
-              <w:right w:val="single" w:sz="4" w:space="0" w:color="000000"/>
-            </w:tcBorders>
-            <w:tcBorders>
-              <w:top w:val="single" w:sz="4" w:space="0" w:color="000000"/>
-              <w:left w:val="single" w:sz="4" w:space="0" w:color="000000"/>
-              <w:bottom w:val="single" w:sz="4" w:space="0" w:color="000000"/>
-              <w:right w:val="single" w:sz="4" w:space="0" w:color="000000"/>
-            </w:tcBorders>
-          </w:tcPr>
-          <w:p>
-            <w:pPr>
-              <w:pStyle w:val="Compact"/>
-            </w:pPr>
-          </w:p>
-        </w:tc>
-        <w:tc>
-          <w:tcPr>
-            <w:tcBorders>
-              <w:top w:val="single" w:sz="4" w:space="0" w:color="000000"/>
-              <w:left w:val="single" w:sz="4" w:space="0" w:color="000000"/>
-              <w:bottom w:val="single" w:sz="4" w:space="0" w:color="000000"/>
-              <w:right w:val="single" w:sz="4" w:space="0" w:color="000000"/>
-            </w:tcBorders>
-            <w:tcBorders>
-              <w:top w:val="single" w:sz="4" w:space="0" w:color="000000"/>
-              <w:left w:val="single" w:sz="4" w:space="0" w:color="000000"/>
-              <w:bottom w:val="single" w:sz="4" w:space="0" w:color="000000"/>
-              <w:right w:val="single" w:sz="4" w:space="0" w:color="000000"/>
-            </w:tcBorders>
-          </w:tcPr>
-          <w:p>
-            <w:pPr>
-              <w:pStyle w:val="Compact"/>
-            </w:pPr>
-          </w:p>
-        </w:tc>
-        <w:tc>
-          <w:tcPr>
-            <w:tcBorders>
-              <w:top w:val="single" w:sz="4" w:space="0" w:color="000000"/>
-              <w:left w:val="single" w:sz="4" w:space="0" w:color="000000"/>
-              <w:bottom w:val="single" w:sz="4" w:space="0" w:color="000000"/>
-              <w:right w:val="single" w:sz="4" w:space="0" w:color="000000"/>
-            </w:tcBorders>
+          </w:tcPr>
+          <w:p>
+            <w:pPr>
+              <w:pStyle w:val="Compact"/>
+            </w:pPr>
+          </w:p>
+        </w:tc>
+        <w:tc>
+          <w:tcPr>
+            <w:tcBorders>
+              <w:top w:val="single" w:sz="4" w:space="0" w:color="000000"/>
+              <w:left w:val="single" w:sz="4" w:space="0" w:color="000000"/>
+              <w:bottom w:val="single" w:sz="4" w:space="0" w:color="000000"/>
+              <w:right w:val="single" w:sz="4" w:space="0" w:color="000000"/>
+            </w:tcBorders>
+          </w:tcPr>
+          <w:p>
+            <w:pPr>
+              <w:pStyle w:val="Compact"/>
+            </w:pPr>
+          </w:p>
+        </w:tc>
+        <w:tc>
+          <w:tcPr>
+            <w:tcBorders>
+              <w:top w:val="single" w:sz="4" w:space="0" w:color="000000"/>
+              <w:left w:val="single" w:sz="4" w:space="0" w:color="000000"/>
+              <w:bottom w:val="single" w:sz="4" w:space="0" w:color="000000"/>
+              <w:right w:val="single" w:sz="4" w:space="0" w:color="000000"/>
+            </w:tcBorders>
+          </w:tcPr>
+          <w:p>
+            <w:pPr>
+              <w:pStyle w:val="Compact"/>
+            </w:pPr>
+          </w:p>
+        </w:tc>
+        <w:tc>
+          <w:tcPr>
+            <w:tcBorders>
+              <w:top w:val="single" w:sz="4" w:space="0" w:color="000000"/>
+              <w:left w:val="single" w:sz="4" w:space="0" w:color="000000"/>
+              <w:bottom w:val="single" w:sz="4" w:space="0" w:color="000000"/>
+              <w:right w:val="single" w:sz="4" w:space="0" w:color="000000"/>
+            </w:tcBorders>
+          </w:tcPr>
+          <w:p>
+            <w:pPr>
+              <w:pStyle w:val="Compact"/>
+            </w:pPr>
+          </w:p>
+        </w:tc>
+      </w:tr>
+      <w:tr>
+        <w:tc>
+          <w:tcPr>
+            <w:tcBorders>
+              <w:top w:val="single" w:sz="4" w:space="0" w:color="000000"/>
+              <w:left w:val="single" w:sz="4" w:space="0" w:color="000000"/>
+              <w:bottom w:val="single" w:sz="4" w:space="0" w:color="000000"/>
+              <w:right w:val="single" w:sz="4" w:space="0" w:color="000000"/>
+            </w:tcBorders>
+          </w:tcPr>
+          <w:p>
+            <w:pPr>
+              <w:pStyle w:val="Compact"/>
+            </w:pPr>
+          </w:p>
+        </w:tc>
+        <w:tc>
+          <w:tcPr>
+            <w:tcBorders>
+              <w:top w:val="single" w:sz="4" w:space="0" w:color="000000"/>
+              <w:left w:val="single" w:sz="4" w:space="0" w:color="000000"/>
+              <w:bottom w:val="single" w:sz="4" w:space="0" w:color="000000"/>
+              <w:right w:val="single" w:sz="4" w:space="0" w:color="000000"/>
+            </w:tcBorders>
+          </w:tcPr>
+          <w:p>
+            <w:pPr>
+              <w:pStyle w:val="Compact"/>
+            </w:pPr>
+          </w:p>
+        </w:tc>
+        <w:tc>
+          <w:tcPr>
+            <w:tcBorders>
+              <w:top w:val="single" w:sz="4" w:space="0" w:color="000000"/>
+              <w:left w:val="single" w:sz="4" w:space="0" w:color="000000"/>
+              <w:bottom w:val="single" w:sz="4" w:space="0" w:color="000000"/>
+              <w:right w:val="single" w:sz="4" w:space="0" w:color="000000"/>
+            </w:tcBorders>
+          </w:tcPr>
+          <w:p>
+            <w:pPr>
+              <w:pStyle w:val="Compact"/>
+            </w:pPr>
+          </w:p>
+        </w:tc>
+        <w:tc>
+          <w:tcPr>
+            <w:tcBorders>
+              <w:top w:val="single" w:sz="4" w:space="0" w:color="000000"/>
+              <w:left w:val="single" w:sz="4" w:space="0" w:color="000000"/>
+              <w:bottom w:val="single" w:sz="4" w:space="0" w:color="000000"/>
+              <w:right w:val="single" w:sz="4" w:space="0" w:color="000000"/>
+            </w:tcBorders>
+          </w:tcPr>
+          <w:p>
+            <w:pPr>
+              <w:pStyle w:val="Compact"/>
+            </w:pPr>
+          </w:p>
+        </w:tc>
+      </w:tr>
+      <w:tr>
+        <w:tc>
+          <w:tcPr>
+            <w:tcBorders>
+              <w:top w:val="single" w:sz="4" w:space="0" w:color="000000"/>
+              <w:left w:val="single" w:sz="4" w:space="0" w:color="000000"/>
+              <w:bottom w:val="single" w:sz="4" w:space="0" w:color="000000"/>
+              <w:right w:val="single" w:sz="4" w:space="0" w:color="000000"/>
+            </w:tcBorders>
+          </w:tcPr>
+          <w:p>
+            <w:pPr>
+              <w:pStyle w:val="Compact"/>
+            </w:pPr>
+          </w:p>
+        </w:tc>
+        <w:tc>
+          <w:tcPr>
+            <w:tcBorders>
+              <w:top w:val="single" w:sz="4" w:space="0" w:color="000000"/>
+              <w:left w:val="single" w:sz="4" w:space="0" w:color="000000"/>
+              <w:bottom w:val="single" w:sz="4" w:space="0" w:color="000000"/>
+              <w:right w:val="single" w:sz="4" w:space="0" w:color="000000"/>
+            </w:tcBorders>
+          </w:tcPr>
+          <w:p>
+            <w:pPr>
+              <w:pStyle w:val="Compact"/>
+            </w:pPr>
+          </w:p>
+        </w:tc>
+        <w:tc>
+          <w:tcPr>
+            <w:tcBorders>
+              <w:top w:val="single" w:sz="4" w:space="0" w:color="000000"/>
+              <w:left w:val="single" w:sz="4" w:space="0" w:color="000000"/>
+              <w:bottom w:val="single" w:sz="4" w:space="0" w:color="000000"/>
+              <w:right w:val="single" w:sz="4" w:space="0" w:color="000000"/>
+            </w:tcBorders>
+          </w:tcPr>
+          <w:p>
+            <w:pPr>
+              <w:pStyle w:val="Compact"/>
+            </w:pPr>
+          </w:p>
+        </w:tc>
+        <w:tc>
+          <w:tcPr>
             <w:tcBorders>
               <w:top w:val="single" w:sz="4" w:space="0" w:color="000000"/>
               <w:left w:val="single" w:sz="4" w:space="0" w:color="000000"/>
@@ -3031,12 +2449,6 @@
               <w:bottom w:val="single" w:sz="4" w:space="0" w:color="000000"/>
               <w:right w:val="single" w:sz="4" w:space="0" w:color="000000"/>
             </w:tcBorders>
-            <w:tcBorders>
-              <w:top w:val="single" w:sz="4" w:space="0" w:color="000000"/>
-              <w:left w:val="single" w:sz="4" w:space="0" w:color="000000"/>
-              <w:bottom w:val="single" w:sz="4" w:space="0" w:color="000000"/>
-              <w:right w:val="single" w:sz="4" w:space="0" w:color="000000"/>
-            </w:tcBorders>
           </w:tcPr>
           <w:p>
             <w:pPr>
@@ -3055,12 +2467,6 @@
               <w:bottom w:val="single" w:sz="4" w:space="0" w:color="000000"/>
               <w:right w:val="single" w:sz="4" w:space="0" w:color="000000"/>
             </w:tcBorders>
-            <w:tcBorders>
-              <w:top w:val="single" w:sz="4" w:space="0" w:color="000000"/>
-              <w:left w:val="single" w:sz="4" w:space="0" w:color="000000"/>
-              <w:bottom w:val="single" w:sz="4" w:space="0" w:color="000000"/>
-              <w:right w:val="single" w:sz="4" w:space="0" w:color="000000"/>
-            </w:tcBorders>
           </w:tcPr>
           <w:p>
             <w:pPr>
@@ -3081,12 +2487,6 @@
               <w:bottom w:val="single" w:sz="4" w:space="0" w:color="000000"/>
               <w:right w:val="single" w:sz="4" w:space="0" w:color="000000"/>
             </w:tcBorders>
-            <w:tcBorders>
-              <w:top w:val="single" w:sz="4" w:space="0" w:color="000000"/>
-              <w:left w:val="single" w:sz="4" w:space="0" w:color="000000"/>
-              <w:bottom w:val="single" w:sz="4" w:space="0" w:color="000000"/>
-              <w:right w:val="single" w:sz="4" w:space="0" w:color="000000"/>
-            </w:tcBorders>
           </w:tcPr>
           <w:p>
             <w:pPr>
@@ -3105,12 +2505,6 @@
               <w:bottom w:val="single" w:sz="4" w:space="0" w:color="000000"/>
               <w:right w:val="single" w:sz="4" w:space="0" w:color="000000"/>
             </w:tcBorders>
-            <w:tcBorders>
-              <w:top w:val="single" w:sz="4" w:space="0" w:color="000000"/>
-              <w:left w:val="single" w:sz="4" w:space="0" w:color="000000"/>
-              <w:bottom w:val="single" w:sz="4" w:space="0" w:color="000000"/>
-              <w:right w:val="single" w:sz="4" w:space="0" w:color="000000"/>
-            </w:tcBorders>
           </w:tcPr>
           <w:p>
             <w:pPr>
@@ -3131,12 +2525,6 @@
               <w:bottom w:val="single" w:sz="4" w:space="0" w:color="000000"/>
               <w:right w:val="single" w:sz="4" w:space="0" w:color="000000"/>
             </w:tcBorders>
-            <w:tcBorders>
-              <w:top w:val="single" w:sz="4" w:space="0" w:color="000000"/>
-              <w:left w:val="single" w:sz="4" w:space="0" w:color="000000"/>
-              <w:bottom w:val="single" w:sz="4" w:space="0" w:color="000000"/>
-              <w:right w:val="single" w:sz="4" w:space="0" w:color="000000"/>
-            </w:tcBorders>
           </w:tcPr>
           <w:p>
             <w:pPr>
@@ -3155,29 +2543,17 @@
               <w:bottom w:val="single" w:sz="4" w:space="0" w:color="000000"/>
               <w:right w:val="single" w:sz="4" w:space="0" w:color="000000"/>
             </w:tcBorders>
-            <w:tcBorders>
-              <w:top w:val="single" w:sz="4" w:space="0" w:color="000000"/>
-              <w:left w:val="single" w:sz="4" w:space="0" w:color="000000"/>
-              <w:bottom w:val="single" w:sz="4" w:space="0" w:color="000000"/>
-              <w:right w:val="single" w:sz="4" w:space="0" w:color="000000"/>
-            </w:tcBorders>
-          </w:tcPr>
-          <w:p>
-            <w:pPr>
-              <w:pStyle w:val="Compact"/>
-            </w:pPr>
-          </w:p>
-        </w:tc>
-      </w:tr>
-      <w:tr>
-        <w:tc>
-          <w:tcPr>
-            <w:tcBorders>
-              <w:top w:val="single" w:sz="4" w:space="0" w:color="000000"/>
-              <w:left w:val="single" w:sz="4" w:space="0" w:color="000000"/>
-              <w:bottom w:val="single" w:sz="4" w:space="0" w:color="000000"/>
-              <w:right w:val="single" w:sz="4" w:space="0" w:color="000000"/>
-            </w:tcBorders>
+          </w:tcPr>
+          <w:p>
+            <w:pPr>
+              <w:pStyle w:val="Compact"/>
+            </w:pPr>
+          </w:p>
+        </w:tc>
+      </w:tr>
+      <w:tr>
+        <w:tc>
+          <w:tcPr>
             <w:tcBorders>
               <w:top w:val="single" w:sz="4" w:space="0" w:color="000000"/>
               <w:left w:val="single" w:sz="4" w:space="0" w:color="000000"/>
@@ -3202,12 +2578,6 @@
               <w:bottom w:val="single" w:sz="4" w:space="0" w:color="000000"/>
               <w:right w:val="single" w:sz="4" w:space="0" w:color="000000"/>
             </w:tcBorders>
-            <w:tcBorders>
-              <w:top w:val="single" w:sz="4" w:space="0" w:color="000000"/>
-              <w:left w:val="single" w:sz="4" w:space="0" w:color="000000"/>
-              <w:bottom w:val="single" w:sz="4" w:space="0" w:color="000000"/>
-              <w:right w:val="single" w:sz="4" w:space="0" w:color="000000"/>
-            </w:tcBorders>
           </w:tcPr>
           <w:p>
             <w:pPr>
@@ -3228,12 +2598,6 @@
               <w:bottom w:val="single" w:sz="4" w:space="0" w:color="000000"/>
               <w:right w:val="single" w:sz="4" w:space="0" w:color="000000"/>
             </w:tcBorders>
-            <w:tcBorders>
-              <w:top w:val="single" w:sz="4" w:space="0" w:color="000000"/>
-              <w:left w:val="single" w:sz="4" w:space="0" w:color="000000"/>
-              <w:bottom w:val="single" w:sz="4" w:space="0" w:color="000000"/>
-              <w:right w:val="single" w:sz="4" w:space="0" w:color="000000"/>
-            </w:tcBorders>
           </w:tcPr>
           <w:p>
             <w:pPr>
@@ -3252,29 +2616,17 @@
               <w:bottom w:val="single" w:sz="4" w:space="0" w:color="000000"/>
               <w:right w:val="single" w:sz="4" w:space="0" w:color="000000"/>
             </w:tcBorders>
-            <w:tcBorders>
-              <w:top w:val="single" w:sz="4" w:space="0" w:color="000000"/>
-              <w:left w:val="single" w:sz="4" w:space="0" w:color="000000"/>
-              <w:bottom w:val="single" w:sz="4" w:space="0" w:color="000000"/>
-              <w:right w:val="single" w:sz="4" w:space="0" w:color="000000"/>
-            </w:tcBorders>
-          </w:tcPr>
-          <w:p>
-            <w:pPr>
-              <w:pStyle w:val="Compact"/>
-            </w:pPr>
-          </w:p>
-        </w:tc>
-      </w:tr>
-      <w:tr>
-        <w:tc>
-          <w:tcPr>
-            <w:tcBorders>
-              <w:top w:val="single" w:sz="4" w:space="0" w:color="000000"/>
-              <w:left w:val="single" w:sz="4" w:space="0" w:color="000000"/>
-              <w:bottom w:val="single" w:sz="4" w:space="0" w:color="000000"/>
-              <w:right w:val="single" w:sz="4" w:space="0" w:color="000000"/>
-            </w:tcBorders>
+          </w:tcPr>
+          <w:p>
+            <w:pPr>
+              <w:pStyle w:val="Compact"/>
+            </w:pPr>
+          </w:p>
+        </w:tc>
+      </w:tr>
+      <w:tr>
+        <w:tc>
+          <w:tcPr>
             <w:tcBorders>
               <w:top w:val="single" w:sz="4" w:space="0" w:color="000000"/>
               <w:left w:val="single" w:sz="4" w:space="0" w:color="000000"/>
@@ -3293,12 +2645,6 @@
         </w:tc>
         <w:tc>
           <w:tcPr>
-            <w:tcBorders>
-              <w:top w:val="single" w:sz="4" w:space="0" w:color="000000"/>
-              <w:left w:val="single" w:sz="4" w:space="0" w:color="000000"/>
-              <w:bottom w:val="single" w:sz="4" w:space="0" w:color="000000"/>
-              <w:right w:val="single" w:sz="4" w:space="0" w:color="000000"/>
-            </w:tcBorders>
             <w:tcBorders>
               <w:top w:val="single" w:sz="4" w:space="0" w:color="000000"/>
               <w:left w:val="single" w:sz="4" w:space="0" w:color="000000"/>
@@ -3514,12 +2860,6 @@
               <w:bottom w:val="single" w:sz="4" w:space="0" w:color="000000"/>
               <w:right w:val="single" w:sz="4" w:space="0" w:color="000000"/>
             </w:tcBorders>
-            <w:tcBorders>
-              <w:top w:val="single" w:sz="4" w:space="0" w:color="000000"/>
-              <w:left w:val="single" w:sz="4" w:space="0" w:color="000000"/>
-              <w:bottom w:val="single" w:sz="4" w:space="0" w:color="000000"/>
-              <w:right w:val="single" w:sz="4" w:space="0" w:color="000000"/>
-            </w:tcBorders>
           </w:tcPr>
           <w:p>
             <w:pPr>
@@ -3538,12 +2878,6 @@
               <w:bottom w:val="single" w:sz="4" w:space="0" w:color="000000"/>
               <w:right w:val="single" w:sz="4" w:space="0" w:color="000000"/>
             </w:tcBorders>
-            <w:tcBorders>
-              <w:top w:val="single" w:sz="4" w:space="0" w:color="000000"/>
-              <w:left w:val="single" w:sz="4" w:space="0" w:color="000000"/>
-              <w:bottom w:val="single" w:sz="4" w:space="0" w:color="000000"/>
-              <w:right w:val="single" w:sz="4" w:space="0" w:color="000000"/>
-            </w:tcBorders>
           </w:tcPr>
           <w:p>
             <w:pPr>
@@ -3564,6 +2898,42 @@
               <w:bottom w:val="single" w:sz="4" w:space="0" w:color="000000"/>
               <w:right w:val="single" w:sz="4" w:space="0" w:color="000000"/>
             </w:tcBorders>
+          </w:tcPr>
+          <w:p>
+            <w:pPr>
+              <w:pStyle w:val="Compact"/>
+            </w:pPr>
+            <w:r>
+              <w:rPr>
+                <w:b/>
+                <w:bCs/>
+              </w:rPr>
+              <w:t xml:space="preserve">4 - Destacado</w:t>
+            </w:r>
+          </w:p>
+        </w:tc>
+        <w:tc>
+          <w:tcPr>
+            <w:tcBorders>
+              <w:top w:val="single" w:sz="4" w:space="0" w:color="000000"/>
+              <w:left w:val="single" w:sz="4" w:space="0" w:color="000000"/>
+              <w:bottom w:val="single" w:sz="4" w:space="0" w:color="000000"/>
+              <w:right w:val="single" w:sz="4" w:space="0" w:color="000000"/>
+            </w:tcBorders>
+          </w:tcPr>
+          <w:p>
+            <w:pPr>
+              <w:pStyle w:val="Compact"/>
+            </w:pPr>
+            <w:r>
+              <w:t xml:space="preserve">Cada criterio o reactivo describe algo observable y específico. Dos evaluadores distintos llegarían al mismo nivel de desempeño para el mismo trabajo. El estudiante sabe exactamente qué hacer para alcanzar el nivel más alto.</w:t>
+            </w:r>
+          </w:p>
+        </w:tc>
+      </w:tr>
+      <w:tr>
+        <w:tc>
+          <w:tcPr>
             <w:tcBorders>
               <w:top w:val="single" w:sz="4" w:space="0" w:color="000000"/>
               <w:left w:val="single" w:sz="4" w:space="0" w:color="000000"/>
@@ -3592,32 +2962,44 @@
               <w:bottom w:val="single" w:sz="4" w:space="0" w:color="000000"/>
               <w:right w:val="single" w:sz="4" w:space="0" w:color="000000"/>
             </w:tcBorders>
-            <w:tcBorders>
-              <w:top w:val="single" w:sz="4" w:space="0" w:color="000000"/>
-              <w:left w:val="single" w:sz="4" w:space="0" w:color="000000"/>
-              <w:bottom w:val="single" w:sz="4" w:space="0" w:color="000000"/>
-              <w:right w:val="single" w:sz="4" w:space="0" w:color="000000"/>
-            </w:tcBorders>
-          </w:tcPr>
-          <w:p>
-            <w:pPr>
-              <w:pStyle w:val="Compact"/>
-            </w:pPr>
-            <w:r>
-              <w:t xml:space="preserve">Cada criterio o reactivo describe algo observable y específico. Dos evaluadores distintos llegarían al mismo nivel de desempeño para el mismo trabajo. El estudiante sabe exactamente qué hacer para alcanzar el nivel más alto.</w:t>
-            </w:r>
-          </w:p>
-        </w:tc>
-      </w:tr>
-      <w:tr>
-        <w:tc>
-          <w:tcPr>
-            <w:tcBorders>
-              <w:top w:val="single" w:sz="4" w:space="0" w:color="000000"/>
-              <w:left w:val="single" w:sz="4" w:space="0" w:color="000000"/>
-              <w:bottom w:val="single" w:sz="4" w:space="0" w:color="000000"/>
-              <w:right w:val="single" w:sz="4" w:space="0" w:color="000000"/>
-            </w:tcBorders>
+          </w:tcPr>
+          <w:p>
+            <w:pPr>
+              <w:pStyle w:val="Compact"/>
+            </w:pPr>
+            <w:r>
+              <w:t xml:space="preserve">La mayoría de los criterios son claros, pero uno o dos tienen ambigüedades o usan términos subjetivos (</w:t>
+            </w:r>
+            <w:r>
+              <w:t xml:space="preserve">“buena redacción”</w:t>
+            </w:r>
+            <w:r>
+              <w:t xml:space="preserve">,</w:t>
+            </w:r>
+            <w:r>
+              <w:t xml:space="preserve"> </w:t>
+            </w:r>
+            <w:r>
+              <w:t xml:space="preserve">“apropiado”</w:t>
+            </w:r>
+            <w:r>
+              <w:t xml:space="preserve">,</w:t>
+            </w:r>
+            <w:r>
+              <w:t xml:space="preserve"> </w:t>
+            </w:r>
+            <w:r>
+              <w:t xml:space="preserve">“suficiente”</w:t>
+            </w:r>
+            <w:r>
+              <w:t xml:space="preserve">).</w:t>
+            </w:r>
+          </w:p>
+        </w:tc>
+      </w:tr>
+      <w:tr>
+        <w:tc>
+          <w:tcPr>
             <w:tcBorders>
               <w:top w:val="single" w:sz="4" w:space="0" w:color="000000"/>
               <w:left w:val="single" w:sz="4" w:space="0" w:color="000000"/>
@@ -3634,96 +3016,12 @@
                 <w:b/>
                 <w:bCs/>
               </w:rPr>
-              <w:t xml:space="preserve">2 - En desarrollo</w:t>
-            </w:r>
-          </w:p>
-        </w:tc>
-        <w:tc>
-          <w:tcPr>
-            <w:tcBorders>
-              <w:top w:val="single" w:sz="4" w:space="0" w:color="000000"/>
-              <w:left w:val="single" w:sz="4" w:space="0" w:color="000000"/>
-              <w:bottom w:val="single" w:sz="4" w:space="0" w:color="000000"/>
-              <w:right w:val="single" w:sz="4" w:space="0" w:color="000000"/>
-            </w:tcBorders>
-            <w:tcBorders>
-              <w:top w:val="single" w:sz="4" w:space="0" w:color="000000"/>
-              <w:left w:val="single" w:sz="4" w:space="0" w:color="000000"/>
-              <w:bottom w:val="single" w:sz="4" w:space="0" w:color="000000"/>
-              <w:right w:val="single" w:sz="4" w:space="0" w:color="000000"/>
-            </w:tcBorders>
-          </w:tcPr>
-          <w:p>
-            <w:pPr>
-              <w:pStyle w:val="Compact"/>
-            </w:pPr>
-            <w:r>
-              <w:t xml:space="preserve">La mayoría de los criterios son claros, pero uno o dos tienen ambigüedades o usan términos subjetivos (</w:t>
-            </w:r>
-            <w:r>
-              <w:t xml:space="preserve">“buena redacción”</w:t>
-            </w:r>
-            <w:r>
-              <w:t xml:space="preserve">,</w:t>
-            </w:r>
-            <w:r>
-              <w:t xml:space="preserve"> </w:t>
-            </w:r>
-            <w:r>
-              <w:t xml:space="preserve">“apropiado”</w:t>
-            </w:r>
-            <w:r>
-              <w:t xml:space="preserve">,</w:t>
-            </w:r>
-            <w:r>
-              <w:t xml:space="preserve"> </w:t>
-            </w:r>
-            <w:r>
-              <w:t xml:space="preserve">“suficiente”</w:t>
-            </w:r>
-            <w:r>
-              <w:t xml:space="preserve">).</w:t>
-            </w:r>
-          </w:p>
-        </w:tc>
-      </w:tr>
-      <w:tr>
-        <w:tc>
-          <w:tcPr>
-            <w:tcBorders>
-              <w:top w:val="single" w:sz="4" w:space="0" w:color="000000"/>
-              <w:left w:val="single" w:sz="4" w:space="0" w:color="000000"/>
-              <w:bottom w:val="single" w:sz="4" w:space="0" w:color="000000"/>
-              <w:right w:val="single" w:sz="4" w:space="0" w:color="000000"/>
-            </w:tcBorders>
-            <w:tcBorders>
-              <w:top w:val="single" w:sz="4" w:space="0" w:color="000000"/>
-              <w:left w:val="single" w:sz="4" w:space="0" w:color="000000"/>
-              <w:bottom w:val="single" w:sz="4" w:space="0" w:color="000000"/>
-              <w:right w:val="single" w:sz="4" w:space="0" w:color="000000"/>
-            </w:tcBorders>
-          </w:tcPr>
-          <w:p>
-            <w:pPr>
-              <w:pStyle w:val="Compact"/>
-            </w:pPr>
-            <w:r>
-              <w:rPr>
-                <w:b/>
-                <w:bCs/>
-              </w:rPr>
-              <w:t xml:space="preserve">1 - Inicial</w:t>
-            </w:r>
-          </w:p>
-        </w:tc>
-        <w:tc>
-          <w:tcPr>
-            <w:tcBorders>
-              <w:top w:val="single" w:sz="4" w:space="0" w:color="000000"/>
-              <w:left w:val="single" w:sz="4" w:space="0" w:color="000000"/>
-              <w:bottom w:val="single" w:sz="4" w:space="0" w:color="000000"/>
-              <w:right w:val="single" w:sz="4" w:space="0" w:color="000000"/>
-            </w:tcBorders>
+              <w:t xml:space="preserve">2 - Básico</w:t>
+            </w:r>
+          </w:p>
+        </w:tc>
+        <w:tc>
+          <w:tcPr>
             <w:tcBorders>
               <w:top w:val="single" w:sz="4" w:space="0" w:color="000000"/>
               <w:left w:val="single" w:sz="4" w:space="0" w:color="000000"/>
@@ -3810,12 +3108,6 @@
               <w:bottom w:val="single" w:sz="4" w:space="0" w:color="000000"/>
               <w:right w:val="single" w:sz="4" w:space="0" w:color="000000"/>
             </w:tcBorders>
-            <w:tcBorders>
-              <w:top w:val="single" w:sz="4" w:space="0" w:color="000000"/>
-              <w:left w:val="single" w:sz="4" w:space="0" w:color="000000"/>
-              <w:bottom w:val="single" w:sz="4" w:space="0" w:color="000000"/>
-              <w:right w:val="single" w:sz="4" w:space="0" w:color="000000"/>
-            </w:tcBorders>
           </w:tcPr>
           <w:p>
             <w:pPr>
@@ -3834,12 +3126,6 @@
               <w:bottom w:val="single" w:sz="4" w:space="0" w:color="000000"/>
               <w:right w:val="single" w:sz="4" w:space="0" w:color="000000"/>
             </w:tcBorders>
-            <w:tcBorders>
-              <w:top w:val="single" w:sz="4" w:space="0" w:color="000000"/>
-              <w:left w:val="single" w:sz="4" w:space="0" w:color="000000"/>
-              <w:bottom w:val="single" w:sz="4" w:space="0" w:color="000000"/>
-              <w:right w:val="single" w:sz="4" w:space="0" w:color="000000"/>
-            </w:tcBorders>
           </w:tcPr>
           <w:p>
             <w:pPr>
@@ -3860,6 +3146,42 @@
               <w:bottom w:val="single" w:sz="4" w:space="0" w:color="000000"/>
               <w:right w:val="single" w:sz="4" w:space="0" w:color="000000"/>
             </w:tcBorders>
+          </w:tcPr>
+          <w:p>
+            <w:pPr>
+              <w:pStyle w:val="Compact"/>
+            </w:pPr>
+            <w:r>
+              <w:rPr>
+                <w:b/>
+                <w:bCs/>
+              </w:rPr>
+              <w:t xml:space="preserve">4 - Destacado</w:t>
+            </w:r>
+          </w:p>
+        </w:tc>
+        <w:tc>
+          <w:tcPr>
+            <w:tcBorders>
+              <w:top w:val="single" w:sz="4" w:space="0" w:color="000000"/>
+              <w:left w:val="single" w:sz="4" w:space="0" w:color="000000"/>
+              <w:bottom w:val="single" w:sz="4" w:space="0" w:color="000000"/>
+              <w:right w:val="single" w:sz="4" w:space="0" w:color="000000"/>
+            </w:tcBorders>
+          </w:tcPr>
+          <w:p>
+            <w:pPr>
+              <w:pStyle w:val="Compact"/>
+            </w:pPr>
+            <w:r>
+              <w:t xml:space="preserve">El instrumento mide directamente la habilidad o competencia definida en la brecha. Si el estudiante obtiene el nivel alto, eso indica que la brecha se cerró.</w:t>
+            </w:r>
+          </w:p>
+        </w:tc>
+      </w:tr>
+      <w:tr>
+        <w:tc>
+          <w:tcPr>
             <w:tcBorders>
               <w:top w:val="single" w:sz="4" w:space="0" w:color="000000"/>
               <w:left w:val="single" w:sz="4" w:space="0" w:color="000000"/>
@@ -3888,32 +3210,20 @@
               <w:bottom w:val="single" w:sz="4" w:space="0" w:color="000000"/>
               <w:right w:val="single" w:sz="4" w:space="0" w:color="000000"/>
             </w:tcBorders>
-            <w:tcBorders>
-              <w:top w:val="single" w:sz="4" w:space="0" w:color="000000"/>
-              <w:left w:val="single" w:sz="4" w:space="0" w:color="000000"/>
-              <w:bottom w:val="single" w:sz="4" w:space="0" w:color="000000"/>
-              <w:right w:val="single" w:sz="4" w:space="0" w:color="000000"/>
-            </w:tcBorders>
-          </w:tcPr>
-          <w:p>
-            <w:pPr>
-              <w:pStyle w:val="Compact"/>
-            </w:pPr>
-            <w:r>
-              <w:t xml:space="preserve">El instrumento mide directamente la habilidad o competencia definida en la brecha. Si el estudiante obtiene el nivel alto, eso indica que la brecha se cerró.</w:t>
-            </w:r>
-          </w:p>
-        </w:tc>
-      </w:tr>
-      <w:tr>
-        <w:tc>
-          <w:tcPr>
-            <w:tcBorders>
-              <w:top w:val="single" w:sz="4" w:space="0" w:color="000000"/>
-              <w:left w:val="single" w:sz="4" w:space="0" w:color="000000"/>
-              <w:bottom w:val="single" w:sz="4" w:space="0" w:color="000000"/>
-              <w:right w:val="single" w:sz="4" w:space="0" w:color="000000"/>
-            </w:tcBorders>
+          </w:tcPr>
+          <w:p>
+            <w:pPr>
+              <w:pStyle w:val="Compact"/>
+            </w:pPr>
+            <w:r>
+              <w:t xml:space="preserve">El instrumento mide algo relacionado con la brecha pero no exactamente lo mismo. Habría que inferir la conexión.</w:t>
+            </w:r>
+          </w:p>
+        </w:tc>
+      </w:tr>
+      <w:tr>
+        <w:tc>
+          <w:tcPr>
             <w:tcBorders>
               <w:top w:val="single" w:sz="4" w:space="0" w:color="000000"/>
               <w:left w:val="single" w:sz="4" w:space="0" w:color="000000"/>
@@ -3930,72 +3240,12 @@
                 <w:b/>
                 <w:bCs/>
               </w:rPr>
-              <w:t xml:space="preserve">2 - En desarrollo</w:t>
-            </w:r>
-          </w:p>
-        </w:tc>
-        <w:tc>
-          <w:tcPr>
-            <w:tcBorders>
-              <w:top w:val="single" w:sz="4" w:space="0" w:color="000000"/>
-              <w:left w:val="single" w:sz="4" w:space="0" w:color="000000"/>
-              <w:bottom w:val="single" w:sz="4" w:space="0" w:color="000000"/>
-              <w:right w:val="single" w:sz="4" w:space="0" w:color="000000"/>
-            </w:tcBorders>
-            <w:tcBorders>
-              <w:top w:val="single" w:sz="4" w:space="0" w:color="000000"/>
-              <w:left w:val="single" w:sz="4" w:space="0" w:color="000000"/>
-              <w:bottom w:val="single" w:sz="4" w:space="0" w:color="000000"/>
-              <w:right w:val="single" w:sz="4" w:space="0" w:color="000000"/>
-            </w:tcBorders>
-          </w:tcPr>
-          <w:p>
-            <w:pPr>
-              <w:pStyle w:val="Compact"/>
-            </w:pPr>
-            <w:r>
-              <w:t xml:space="preserve">El instrumento mide algo relacionado con la brecha pero no exactamente lo mismo. Habría que inferir la conexión.</w:t>
-            </w:r>
-          </w:p>
-        </w:tc>
-      </w:tr>
-      <w:tr>
-        <w:tc>
-          <w:tcPr>
-            <w:tcBorders>
-              <w:top w:val="single" w:sz="4" w:space="0" w:color="000000"/>
-              <w:left w:val="single" w:sz="4" w:space="0" w:color="000000"/>
-              <w:bottom w:val="single" w:sz="4" w:space="0" w:color="000000"/>
-              <w:right w:val="single" w:sz="4" w:space="0" w:color="000000"/>
-            </w:tcBorders>
-            <w:tcBorders>
-              <w:top w:val="single" w:sz="4" w:space="0" w:color="000000"/>
-              <w:left w:val="single" w:sz="4" w:space="0" w:color="000000"/>
-              <w:bottom w:val="single" w:sz="4" w:space="0" w:color="000000"/>
-              <w:right w:val="single" w:sz="4" w:space="0" w:color="000000"/>
-            </w:tcBorders>
-          </w:tcPr>
-          <w:p>
-            <w:pPr>
-              <w:pStyle w:val="Compact"/>
-            </w:pPr>
-            <w:r>
-              <w:rPr>
-                <w:b/>
-                <w:bCs/>
-              </w:rPr>
-              <w:t xml:space="preserve">1 - Inicial</w:t>
-            </w:r>
-          </w:p>
-        </w:tc>
-        <w:tc>
-          <w:tcPr>
-            <w:tcBorders>
-              <w:top w:val="single" w:sz="4" w:space="0" w:color="000000"/>
-              <w:left w:val="single" w:sz="4" w:space="0" w:color="000000"/>
-              <w:bottom w:val="single" w:sz="4" w:space="0" w:color="000000"/>
-              <w:right w:val="single" w:sz="4" w:space="0" w:color="000000"/>
-            </w:tcBorders>
+              <w:t xml:space="preserve">2 - Básico</w:t>
+            </w:r>
+          </w:p>
+        </w:tc>
+        <w:tc>
+          <w:tcPr>
             <w:tcBorders>
               <w:top w:val="single" w:sz="4" w:space="0" w:color="000000"/>
               <w:left w:val="single" w:sz="4" w:space="0" w:color="000000"/>

</xml_diff>